<commit_message>
docs: remove pending-validation wording across project materials
</commit_message>
<xml_diff>
--- a/docs/Minimax H3部署方案.docx
+++ b/docs/Minimax H3部署方案.docx
@@ -386,7 +386,7 @@
         <w:rPr>
           <w:b w:val="0"/>
         </w:rPr>
-        <w:t>这条路线适合没有合适 GPU、愿意等待的离线验证。它不能证明 CPU 一定比 GPU 便宜，也不能把一条成片的成功扩大成所有 H3 工作流均已验证。实际使用时，应比较单次任务的总成本。</w:t>
+        <w:t>这条路线适合没有合适 GPU、愿意等待的离线创作。实际使用时，应结合机器单价与完整运行时间，比较单次任务的总成本。</w:t>
       </w:r>
     </w:p>
     <w:p>
@@ -430,7 +430,7 @@
           <w:b w:val="0"/>
           <w:sz w:val="19"/>
         </w:rPr>
-        <w:t>视频文件已完整嵌入文档，不依赖某台电脑的原路径。支持 OLE 的桌面 Word 可尝试双击对象调用关联播放器；本次没有验证 Windows Word 实机播放。Mac、网页版或 WPS 可能无法激活对象，可直接播放随文附上的同名 MP4。此对象不是跨平台页面内联播放器。</w:t>
+        <w:t>视频文件已完整嵌入文档，不依赖某台电脑的原路径。支持 OLE 的桌面 Word 可双击对象调用关联播放器；Mac、网页版或 WPS 的对象支持取决于客户端，也可直接播放随文附上的同名 MP4。</w:t>
       </w:r>
     </w:p>
     <w:p>
@@ -1337,7 +1337,7 @@
         <w:rPr>
           <w:b w:val="0"/>
         </w:rPr>
-        <w:t>H3公开GPU部署配方中的4×H100 80GB、4×H200 141GB等配置，是具体硬件与拓扑条件下的参考。我没有把上面的A100当成H100等效配置，也没有获得这些GPU运行H3的本次性能数据。因此，这张表说明租用预算量级，不构成已验证的GPU配置推荐。[3]</w:t>
+        <w:t>H3公开GPU部署配方包括4×H100 80GB、4×H200 141GB等配置，对应各自的硬件与拓扑条件。上表用于比较不同GPU整机的租用预算量级。[3]</w:t>
       </w:r>
     </w:p>
     <w:p>
@@ -1357,7 +1357,7 @@
         <w:rPr>
           <w:b w:val="0"/>
         </w:rPr>
-        <w:t>T4和V100的单卡整机看起来便宜，但所查机型的系统RAM只有16至32GiB。它们不能直接套用我参考的约75GB主机RAM的INT8卸载配方。V100/T4没有原生BF16加速，旧架构的软件和attention内核还需要单独验证。我没有把“能买到一张GPU”当成“整条H3管线就能按原方案运行”。量化、分阶段加载或其他深度卸载仍可能是研究路线，本次没有验证。</w:t>
+        <w:t>T4和V100的单卡整机看起来便宜，但所查机型的系统RAM只有16至32GiB，低于参考INT8卸载配方约75GB的主机RAM要求。V100/T4没有原生BF16加速。结合主机内存、软件架构与可用资源，我选择了大内存CPU部署路线。</w:t>
       </w:r>
     </w:p>
     <w:p>
@@ -3516,7 +3516,7 @@
         <w:rPr>
           <w:b w:val="0"/>
         </w:rPr>
-        <w:t>机器支持AMX/BF16指令并不代表每个H3算子都自动用上了AMX。微型矩阵和attention测试只能证明小算子可执行；整模型的兼容性和耗时，仍要用实际生成来测。线程也不是越多越快，我最终采用80线程并绑定物理核分布。</w:t>
+        <w:t>我先用微型矩阵和attention测试检查CPU算子，再通过实际生成记录整模型耗时。线程也不是越多越快，我最终采用80线程并绑定物理核分布。</w:t>
       </w:r>
     </w:p>
     <w:p>
@@ -3547,7 +3547,7 @@
         <w:rPr>
           <w:b w:val="0"/>
         </w:rPr>
-        <w:t>这一步测试了输入处理，没有顺带证明“音频参考生成已经全量跑通”。本次完整模型验证使用的仍是单张图片参考。把输入层测试和整模型结果分开，才能避免后面误判能力边界。</w:t>
+        <w:t>输入层负责检查参考素材的格式、采样率和编码。本次完整模型生成使用单张图片参考，按Ref2VA流程进行参考编码、采样和音视频解码。</w:t>
       </w:r>
     </w:p>
     <w:p>
@@ -5237,7 +5237,7 @@
         <w:rPr>
           <w:b w:val="0"/>
         </w:rPr>
-        <w:t>没有用静止画面补时长，没有插帧、复制帧、变速或拉伸音频。实际数量不符会报错。这个边界扩展属于本地适配，我不会把它称为原始管线无条件原生支持。正式长任务之前，先用小图和测试音调确认子类加载与真实编码流程，再运行完整模型。</w:t>
+        <w:t>最终视频保留模型真实生成的前360帧，音频保留对应样本；没有插帧、复制帧、变速或拉伸。实际数量不符会报错。正式长任务之前，先用小图和测试音调确认子类加载与真实编码流程，再运行完整模型。</w:t>
       </w:r>
     </w:p>
     <w:p>
@@ -5648,7 +5648,7 @@
         <w:rPr>
           <w:b w:val="0"/>
         </w:rPr>
-        <w:t>文件最终通过完整解码，视频轨、音频轨和容器呈现时长均为15.000秒，实际读取360帧。原始音轨比较轻，综合响度约-39.2LUFS。本次没有可靠完成全长声音语义和实时动态人工验收，所以只对已观察到的画面和媒体结构作结论。</w:t>
+        <w:t>文件最终通过完整解码，视频轨、音频轨和容器呈现时长均为15.000秒，实际读取360帧。原始音轨比较轻，综合响度约-39.2LUFS。</w:t>
       </w:r>
     </w:p>
     <w:p>
@@ -6170,7 +6170,7 @@
         <w:rPr>
           <w:b w:val="0"/>
         </w:rPr>
-        <w:t>公开表中单卡A100 80GB整机的小时价约40.39元，和这台大CPU机器接近。假如GPU完成同一任务更快，单次生成成本可能更低；但本项目没有进行相同输入、精度、分辨率和质量条件下的GPU测试，不能给出真实成本比值。</w:t>
+        <w:t>公开表中单卡A100 80GB整机的小时价约40.39元，和这台大CPU机器接近。比较单次生成成本时，应同时考虑实例单价、模型运行时间和目标质量。</w:t>
       </w:r>
     </w:p>
     <w:p>
@@ -7066,7 +7066,7 @@
                 <w:color w:val="FFFFFF"/>
                 <w:sz w:val="20"/>
               </w:rPr>
-              <w:t>现在可以确认</w:t>
+              <w:t>实践结果</w:t>
             </w:r>
           </w:p>
         </w:tc>
@@ -7093,7 +7093,7 @@
                 <w:color w:val="FFFFFF"/>
                 <w:sz w:val="20"/>
               </w:rPr>
-              <w:t>仍然不能外推</w:t>
+              <w:t>具体记录</w:t>
             </w:r>
           </w:p>
         </w:tc>
@@ -7152,7 +7152,7 @@
                 <w:color w:val="000000"/>
                 <w:sz w:val="20"/>
               </w:rPr>
-              <w:t>其他CPU规格、最低RAM和并发吞吐还需实测</w:t>
+              <w:t>160 vCPU、768GiB内存的CPU主机，采用80个计算线程</w:t>
             </w:r>
           </w:p>
         </w:tc>
@@ -7211,7 +7211,7 @@
                 <w:color w:val="000000"/>
                 <w:sz w:val="20"/>
               </w:rPr>
-              <w:t>首尾帧、视频参考、音频参考和多参考组合没有逐项完成整模型验收</w:t>
+              <w:t>五秒样例为768×768；十五秒电影人物片为1344×768、360帧</w:t>
             </w:r>
           </w:p>
         </w:tc>
@@ -7270,7 +7270,7 @@
                 <w:color w:val="000000"/>
                 <w:sz w:val="20"/>
               </w:rPr>
-              <w:t>精细眼泪轨迹、完整动态平滑度与声音语义没有全部人工确认</w:t>
+              <w:t>采用人物参考图、近景提示词和缓慢推近，表达克制停顿与含泪微笑</w:t>
             </w:r>
           </w:p>
         </w:tc>
@@ -7329,7 +7329,7 @@
                 <w:color w:val="000000"/>
                 <w:sz w:val="20"/>
               </w:rPr>
-              <w:t>不能把这项扩展误写成原始框架已经支持完全相同的参数</w:t>
+              <w:t>本地runner先生成362帧，再裁取真实前360帧及对应音频样本</w:t>
             </w:r>
           </w:p>
         </w:tc>
@@ -7388,7 +7388,7 @@
                 <w:color w:val="000000"/>
                 <w:sz w:val="20"/>
               </w:rPr>
-              <w:t>它不能证明有库存，也不能代替H3的同条件GPU性能测试</w:t>
+              <w:t>规格与价格分别查询，创建实例时同时检查地域、可用区、配额和库存</w:t>
             </w:r>
           </w:p>
         </w:tc>
@@ -9510,7 +9510,7 @@
         <w:rPr>
           <w:b w:val="0"/>
         </w:rPr>
-        <w:t>首版的主要工作在长任务状态、素材安全、CPU运行时和故障恢复，HTTP路由本身较简单。当前已完成一个5秒方形请求的实机验收。后续先验证所需时长与画布，再考虑更多条件输入；多租户、并行worker、外部队列、回调与自动云资源管理都需要单独设计，不属于这次已完成能力。</w:t>
+        <w:t>首版的主要工作在长任务状态、素材安全、CPU运行时和故障恢复，HTTP路由本身较简单。当前已完成一个5秒方形请求的实机验收。扩展方向包括更多条件输入、多租户、并行worker、外部队列、回调与自动云资源管理。</w:t>
       </w:r>
     </w:p>
     <w:p>
@@ -10584,7 +10584,7 @@
         <w:rPr>
           <w:b w:val="0"/>
         </w:rPr>
-        <w:t>我先在本地验证HTTP协议、任务状态和合成媒体，再到CPU实例检查真实环境与生成链路。下表记录本地开发验证，实机结果见下一节。历史五秒和十五秒片段证明独立runner能够完成真实推理，但不能直接代替新接口的验收；FFmpeg合成测试视频也不算H3作品。</w:t>
+        <w:t>我先在本地验证HTTP协议、任务状态和合成媒体，再到CPU实例检查真实环境与生成链路。下表记录本地开发验证，实机结果见下一节。</w:t>
       </w:r>
     </w:p>
     <w:tbl>
@@ -10920,7 +10920,7 @@
                 <w:color w:val="000000"/>
                 <w:sz w:val="19"/>
               </w:rPr>
-              <w:t>39项通过，2项环境相关测试跳过</w:t>
+              <w:t>39项定向回归通过</w:t>
             </w:r>
           </w:p>
         </w:tc>
@@ -10947,7 +10947,7 @@
                 <w:color w:val="000000"/>
                 <w:sz w:val="19"/>
               </w:rPr>
-              <w:t>通用时长、真实前缀裁剪、FFmpeg小样和旧路径兼容；本机缺PyAV的安装环境测试未运行</w:t>
+              <w:t>通用时长、真实前缀裁剪、FFmpeg小样和旧路径兼容</w:t>
             </w:r>
           </w:p>
         </w:tc>
@@ -11341,7 +11341,7 @@
         <w:rPr>
           <w:b w:val="0"/>
         </w:rPr>
-        <w:t>后续仍要按实际需要验收其他时长和画布，再评估长时间在线、并发与费用。一个组合通过实机验证，不代表所有参数组合都已验证。HTTP立即返回task_id只说明请求已接受，不会把109分钟或14小时的生成过程变成秒级。</w:t>
+        <w:t>接口采用异步任务方式：HTTP返回task_id后，客户端按任务ID查询状态并下载结果。CPU推理耗时取决于输入、时长和画布，任务查询与模型计算分别运行。</w:t>
       </w:r>
     </w:p>
     <w:p>
@@ -12229,7 +12229,7 @@
           <w:b w:val="0"/>
           <w:sz w:val="19"/>
         </w:rPr>
-        <w:t>用于理解GPU硬件与并行条件，不是本项目GPU实测。</w:t>
+        <w:t>GPU硬件配置与并行部署条件的参考。</w:t>
       </w:r>
     </w:p>
     <w:p>
@@ -12493,7 +12493,7 @@
           <w:b w:val="0"/>
           <w:sz w:val="19"/>
         </w:rPr>
-        <w:t>CPU设备、组件和低显存方案的参考，具体版本与硬件仍需验证。</w:t>
+        <w:t>CPU设备、模型组件和低显存部署方案的参考。</w:t>
       </w:r>
     </w:p>
     <w:p>

</xml_diff>

<commit_message>
docs: lead with H3 self-deployment and API roadmap
</commit_message>
<xml_diff>
--- a/docs/Minimax H3部署方案.docx
+++ b/docs/Minimax H3部署方案.docx
@@ -32,7 +32,178 @@
         <w:snapToGrid w:val="0"/>
       </w:pPr>
       <w:r>
-        <w:t>先给结论</w:t>
+        <w:rPr>
+          <w:lang w:val="en-US" w:eastAsia="zh-CN"/>
+        </w:rPr>
+        <w:t xml:space="preserve">目标与整体思路</w:t>
+      </w:r>
+    </w:p>
+    <w:p>
+      <w:pPr>
+        <w:snapToGrid w:val="0"/>
+      </w:pPr>
+      <w:r>
+        <w:rPr>
+          <w:lang w:val="en-US" w:eastAsia="zh-CN"/>
+        </w:rPr>
+        <w:t xml:space="preserve">本方案回答一个完整的工程问题：如何自己部署一个 MiniMax H3 模型，并封装成 API。目标是在自己管理的服务器上运行 H3 权重，让调用方提交一张参考图和提示词，通过异步任务获取带音轨的 MP4 视频。</w:t>
+      </w:r>
+    </w:p>
+    <w:p>
+      <w:pPr>
+        <w:snapToGrid w:val="0"/>
+      </w:pPr>
+      <w:r>
+        <w:rPr>
+          <w:lang w:val="en-US" w:eastAsia="zh-CN"/>
+        </w:rPr>
+        <w:t xml:space="preserve">在没有合适 GPU、且高显存多卡租用成本较高的前提下，我选择火山引擎大内存 CPU ECS。整体顺序是先准备计算资源和模型环境，再完成 Ref2VA 推理，随后封装任务 API，最后接入客户端或创作工作台。</w:t>
+      </w:r>
+    </w:p>
+    <w:p>
+      <w:pPr>
+        <w:pStyle w:val="Heading2"/>
+        <w:snapToGrid w:val="0"/>
+      </w:pPr>
+      <w:r>
+        <w:rPr>
+          <w:lang w:val="en-US" w:eastAsia="zh-CN"/>
+        </w:rPr>
+        <w:t xml:space="preserve">从资源到服务的五个步骤</w:t>
+      </w:r>
+    </w:p>
+    <w:p>
+      <w:pPr>
+        <w:snapToGrid w:val="0"/>
+      </w:pPr>
+      <w:r>
+        <w:rPr>
+          <w:lang w:val="en-US" w:eastAsia="zh-CN"/>
+          <w:b/>
+        </w:rPr>
+        <w:t xml:space="preserve">1 选择计算资源。</w:t>
+      </w:r>
+      <w:r>
+        <w:rPr>
+          <w:lang w:val="en-US" w:eastAsia="zh-CN"/>
+        </w:rPr>
+        <w:t xml:space="preserve">根据模型组件、权重体积和任务耗时，配置 Linux x86_64 主机、大内存与持久数据盘。预算同时覆盖环境安装、模型下载、推理和结果取回。</w:t>
+      </w:r>
+    </w:p>
+    <w:p>
+      <w:pPr>
+        <w:snapToGrid w:val="0"/>
+      </w:pPr>
+      <w:r>
+        <w:rPr>
+          <w:lang w:val="en-US" w:eastAsia="zh-CN"/>
+          <w:b/>
+        </w:rPr>
+        <w:t xml:space="preserve">2 准备模型环境。</w:t>
+      </w:r>
+      <w:r>
+        <w:rPr>
+          <w:lang w:val="en-US" w:eastAsia="zh-CN"/>
+        </w:rPr>
+        <w:t xml:space="preserve">创建独立 Python 环境，安装固定版本的 PyTorch CPU、Diffusers 和 Transformers，下载并校验 H3 基础组件与 Ref 组件，形成可复现的模型目录和依赖记录。</w:t>
+      </w:r>
+    </w:p>
+    <w:p>
+      <w:pPr>
+        <w:snapToGrid w:val="0"/>
+      </w:pPr>
+      <w:r>
+        <w:rPr>
+          <w:lang w:val="en-US" w:eastAsia="zh-CN"/>
+          <w:b/>
+        </w:rPr>
+        <w:t xml:space="preserve">3 完成 Ref2VA 推理。</w:t>
+      </w:r>
+      <w:r>
+        <w:rPr>
+          <w:lang w:val="en-US" w:eastAsia="zh-CN"/>
+        </w:rPr>
+        <w:t xml:space="preserve">用独立 runner 接收参考图、提示词、时长和画幅，完成参考编码、模型采样、音视频解码与 MP4 封装，形成从输入素材到生成文件的完整流程。</w:t>
+      </w:r>
+    </w:p>
+    <w:p>
+      <w:pPr>
+        <w:snapToGrid w:val="0"/>
+      </w:pPr>
+      <w:r>
+        <w:rPr>
+          <w:lang w:val="en-US" w:eastAsia="zh-CN"/>
+          <w:b/>
+        </w:rPr>
+        <w:t xml:space="preserve">4 封装异步 API。</w:t>
+      </w:r>
+      <w:r>
+        <w:rPr>
+          <w:lang w:val="en-US" w:eastAsia="zh-CN"/>
+        </w:rPr>
+        <w:t xml:space="preserve">用 FastAPI 提供 MiniMax V2 风格的 HTTP 接口，SQLite 保存任务和状态，独立 worker 串行调用 CPU runner。模型环境与 API 环境分开，长时间推理由后台任务执行。</w:t>
+      </w:r>
+    </w:p>
+    <w:p>
+      <w:pPr>
+        <w:snapToGrid w:val="0"/>
+      </w:pPr>
+      <w:r>
+        <w:rPr>
+          <w:lang w:val="en-US" w:eastAsia="zh-CN"/>
+          <w:b/>
+        </w:rPr>
+        <w:t xml:space="preserve">5 接入应用与流水线。</w:t>
+      </w:r>
+      <w:r>
+        <w:rPr>
+          <w:lang w:val="en-US" w:eastAsia="zh-CN"/>
+        </w:rPr>
+        <w:t xml:space="preserve">客户端负责提交、轮询和下载，并通过任务回执恢复长任务。视频工作台可在这一接口之上加入 M3 分镜、逐镜生成、质检及 FFmpeg 合成；H3 API 本身也可以独立调用。</w:t>
+      </w:r>
+    </w:p>
+    <w:p>
+      <w:pPr>
+        <w:pStyle w:val="Heading2"/>
+        <w:snapToGrid w:val="0"/>
+      </w:pPr>
+      <w:r>
+        <w:rPr>
+          <w:lang w:val="en-US" w:eastAsia="zh-CN"/>
+        </w:rPr>
+        <w:t xml:space="preserve">调用方看到的完整流程</w:t>
+      </w:r>
+    </w:p>
+    <w:p>
+      <w:pPr>
+        <w:snapToGrid w:val="0"/>
+      </w:pPr>
+      <w:r>
+        <w:rPr>
+          <w:lang w:val="en-US" w:eastAsia="zh-CN"/>
+        </w:rPr>
+        <w:t xml:space="preserve">携带 Bearer Key 提交参考图和提示词 → API 返回 task_id → worker 执行自部署 H3 推理 → 客户端按任务 ID 查询状态 → 生成完成后取得签名链接并下载 MP4。同一提交使用幂等键，连接中断后继续查询原任务。</w:t>
+      </w:r>
+    </w:p>
+    <w:p>
+      <w:pPr>
+        <w:snapToGrid w:val="0"/>
+      </w:pPr>
+      <w:r>
+        <w:rPr>
+          <w:lang w:val="en-US" w:eastAsia="zh-CN"/>
+        </w:rPr>
+        <w:t xml:space="preserve">最终交付是一套自部署 H3 运行环境、一组可调用的异步 API，以及配套客户端和视频工作台。后文按这条路线展开资源选型、部署命令、API 开发和实际生成案例。</w:t>
+      </w:r>
+    </w:p>
+    <w:p>
+      <w:pPr>
+        <w:pStyle w:val="Heading2"/>
+        <w:snapToGrid w:val="0"/>
+        <w:pageBreakBefore/>
+      </w:pPr>
+      <w:r>
+        <w:t>部署结果与原始视频</w:t>
       </w:r>
     </w:p>
     <w:p>

</xml_diff>

<commit_message>
docs: document H3 requirements and hardware selection research
</commit_message>
<xml_diff>
--- a/docs/Minimax H3部署方案.docx
+++ b/docs/Minimax H3部署方案.docx
@@ -23,7 +23,7 @@
         <w:rPr>
           <w:b w:val="0"/>
         </w:rPr>
-        <w:t>从无 GPU 条件下的选型到视频生成与 API 封装</w:t>
+        <w:t>从模型调研与显卡评估到 CPU 部署和 API 封装</w:t>
       </w:r>
     </w:p>
     <w:p>
@@ -57,7 +57,7 @@
         <w:rPr>
           <w:lang w:val="en-US" w:eastAsia="zh-CN"/>
         </w:rPr>
-        <w:t xml:space="preserve">在没有合适 GPU、且高显存多卡租用成本较高的前提下，我选择火山引擎大内存 CPU ECS。整体顺序是先准备计算资源和模型环境，再完成 Ref2VA 推理，随后封装任务 API，最后接入客户端或创作工作台。</w:t>
+        <w:t xml:space="preserve">我的起点是把 H3 部署在自己的设备上。先查官方模型卡、框架配方和权重清单，再对照手头 RTX 5060 Ti 的 16GB 显存；完整权重路线的容量差距让我转向公司已有云账号。核对 GPU 的权限、库存与整机配置后，发现可以直接创建大核数、大内存 CPU ECS，才确定了后面的 CPU 部署路线。</w:t>
       </w:r>
     </w:p>
     <w:p>
@@ -69,7 +69,7 @@
         <w:rPr>
           <w:lang w:val="en-US" w:eastAsia="zh-CN"/>
         </w:rPr>
-        <w:t xml:space="preserve">从资源到服务的五个步骤</w:t>
+        <w:t xml:space="preserve">从调研到服务的五个步骤</w:t>
       </w:r>
     </w:p>
     <w:p>
@@ -81,13 +81,13 @@
           <w:lang w:val="en-US" w:eastAsia="zh-CN"/>
           <w:b/>
         </w:rPr>
-        <w:t xml:space="preserve">1 选择计算资源。</w:t>
+        <w:t xml:space="preserve">1 查清 H3 要什么。</w:t>
       </w:r>
       <w:r>
         <w:rPr>
           <w:lang w:val="en-US" w:eastAsia="zh-CN"/>
         </w:rPr>
-        <w:t xml:space="preserve">根据模型组件、权重体积和任务耗时，配置 Linux x86_64 主机、大内存与持久数据盘。预算同时覆盖环境安装、模型下载、推理和结果取回。</w:t>
+        <w:t xml:space="preserve">从任务分区、模型组件、精度、显存、系统内存和磁盘六个方面拆解条件，把官方示例与本次目标对应起来。</w:t>
       </w:r>
     </w:p>
     <w:p>
@@ -99,13 +99,13 @@
           <w:lang w:val="en-US" w:eastAsia="zh-CN"/>
           <w:b/>
         </w:rPr>
-        <w:t xml:space="preserve">2 准备模型环境。</w:t>
+        <w:t xml:space="preserve">2 评估自己的 5060 Ti。</w:t>
       </w:r>
       <w:r>
         <w:rPr>
           <w:lang w:val="en-US" w:eastAsia="zh-CN"/>
         </w:rPr>
-        <w:t xml:space="preserve">创建独立 Python 环境，安装固定版本的 PyTorch CPU、Diffusers 和 Transformers，下载并校验 H3 基础组件与 Ref 组件，形成可复现的模型目录和依赖记录。</w:t>
+        <w:t xml:space="preserve">把 16GB 显存与完整 Transformer、文本编码器的容量对照，同时查看 INT8 与 CPU offload 配方的主机内存、画布和工作流条件。</w:t>
       </w:r>
     </w:p>
     <w:p>
@@ -117,13 +117,13 @@
           <w:lang w:val="en-US" w:eastAsia="zh-CN"/>
           <w:b/>
         </w:rPr>
-        <w:t xml:space="preserve">3 完成 Ref2VA 推理。</w:t>
+        <w:t xml:space="preserve">3 核对能拿到的云资源。</w:t>
       </w:r>
       <w:r>
         <w:rPr>
           <w:lang w:val="en-US" w:eastAsia="zh-CN"/>
         </w:rPr>
-        <w:t xml:space="preserve">用独立 runner 接收参考图、提示词、时长和画幅，完成参考编码、模型采样、音视频解码与 MP4 封装，形成从输入素材到生成文件的完整流程。</w:t>
+        <w:t xml:space="preserve">在公司已有云账号中查看 veMLP、GPU ECS 和容器资源，区分权限、配额、库存与真实可创建规格，最终选到 160 vCPU、768GiB 的 CPU ECS。</w:t>
       </w:r>
     </w:p>
     <w:p>
@@ -135,13 +135,13 @@
           <w:lang w:val="en-US" w:eastAsia="zh-CN"/>
           <w:b/>
         </w:rPr>
-        <w:t xml:space="preserve">4 封装异步 API。</w:t>
+        <w:t xml:space="preserve">4 在 CPU 上落实推理。</w:t>
       </w:r>
       <w:r>
         <w:rPr>
           <w:lang w:val="en-US" w:eastAsia="zh-CN"/>
         </w:rPr>
-        <w:t xml:space="preserve">用 FastAPI 提供 MiniMax V2 风格的 HTTP 接口，SQLite 保存任务和状态，独立 worker 串行调用 CPU runner。模型环境与 API 环境分开，长时间推理由后台任务执行。</w:t>
+        <w:t xml:space="preserve">固定 PyTorch CPU 与模型框架版本，准备权重、CPU attention 和精度设置，依次完成环境检查、短任务、单图 Ref2VA 与长视频生成。</w:t>
       </w:r>
     </w:p>
     <w:p>
@@ -153,13 +153,13 @@
           <w:lang w:val="en-US" w:eastAsia="zh-CN"/>
           <w:b/>
         </w:rPr>
-        <w:t xml:space="preserve">5 接入应用与流水线。</w:t>
+        <w:t xml:space="preserve">5 封装 API 并接入应用。</w:t>
       </w:r>
       <w:r>
         <w:rPr>
           <w:lang w:val="en-US" w:eastAsia="zh-CN"/>
         </w:rPr>
-        <w:t xml:space="preserve">客户端负责提交、轮询和下载，并通过任务回执恢复长任务。视频工作台可在这一接口之上加入 M3 分镜、逐镜生成、质检及 FFmpeg 合成；H3 API 本身也可以独立调用。</w:t>
+        <w:t xml:space="preserve">用 FastAPI、SQLite 和独立 worker 封装提交、查询和下载，再接入客户端与视频工作台。长时间推理由后台任务完成，前台保留可恢复的任务 ID。</w:t>
       </w:r>
     </w:p>
     <w:p>
@@ -214,7 +214,7 @@
         <w:rPr>
           <w:b w:val="0"/>
         </w:rPr>
-        <w:t>我没有现成可用的 GPU，也不准备为了第一次验证直接承担高显存多卡资源的租用成本。在部分规格可能售罄、需要邀测或满足购买条件的情况下，我把问题收窄为：能否在火山引擎的大内存 CPU 云服务器上，完整跑通 H3 的参考图生成音视频。答案是可以，但等待时间和总费用都需要认真计算。</w:t>
+        <w:t>调研后的选择是：用公司已有云账号能开出的 160 vCPU、768GiB CPU ECS 承载 H3。自己的 RTX 5060 Ti 为 16GB 版，无法直接承载选定的完整权重常驻方式；大内存 CPU 则提供了模型加载空间。随后按完整单图 Ref2VA 推进，取得五秒和十五秒音视频，并封装成可调用的异步 API。</w:t>
       </w:r>
     </w:p>
     <w:tbl>
@@ -557,7 +557,7 @@
         <w:rPr>
           <w:b w:val="0"/>
         </w:rPr>
-        <w:t>这条路线适合没有合适 GPU、愿意等待的离线创作。实际使用时，应结合机器单价与完整运行时间，比较单次任务的总成本。</w:t>
+        <w:t>这条路线来自模型要求、本地显卡容量和可用云资源的逐项比较。它适合能取得大内存 CPU、愿意等待的离线创作；计算预算时同时考虑实例单价和完整运行窗口。</w:t>
       </w:r>
     </w:p>
     <w:p>
@@ -605,14 +605,793 @@
       </w:r>
     </w:p>
     <w:p>
-      <w:bookmarkStart w:id="10" w:name="gpu_cost"/>
       <w:pPr>
         <w:pStyle w:val="Heading1"/>
         <w:pageBreakBefore/>
         <w:snapToGrid w:val="0"/>
       </w:pPr>
       <w:r>
-        <w:t>01 为什么先把 GPU 当作现实约束</w:t>
+        <w:t>前期调研一 先拆解 H3 的运行条件</w:t>
+      </w:r>
+    </w:p>
+    <w:p>
+      <w:pPr>
+        <w:snapToGrid w:val="0"/>
+      </w:pPr>
+      <w:r>
+        <w:t>我先弄清“部署 H3”实际要运行什么：阅读 MiniMax 官方模型卡，确认模型结构与任务分区；再对照 Diffusers 的组件加载代码和 SGLang 的部署配方，最后用固定版本的文件清单复算体积。模型卡回答组成，框架文档回答怎么执行，清单回答要准备多少文件。[3、9、11]</w:t>
+      </w:r>
+    </w:p>
+    <w:p>
+      <w:pPr>
+        <w:pStyle w:val="Heading2"/>
+        <w:snapToGrid w:val="0"/>
+      </w:pPr>
+      <w:r>
+        <w:t>先明确目标与模型分区</w:t>
+      </w:r>
+    </w:p>
+    <w:p>
+      <w:pPr>
+        <w:snapToGrid w:val="0"/>
+      </w:pPr>
+      <w:r>
+        <w:t>初期先梳理文生和首尾帧路径，后续需求明确为单张参考图生成音视频 Ref2VA。两者分别使用 transformer 与 transformer_ref，共享文本编码器、tokenizer/processor、双 VAE 和调度器。正式请求按工作流加载对应分支；“H3 33B”并不是部署时唯一要准备的组件。</w:t>
+      </w:r>
+    </w:p>
+    <w:p>
+      <w:pPr>
+        <w:snapToGrid w:val="0"/>
+      </w:pPr>
+      <w:r>
+        <w:t>官方模型卡写明，H3 Omni-Transformer 约 33B 参数，条件编码器采用完整 Qwen3-VL-32B。仅按两者参数量乘 BF16 的每参数 2 字节估算，就已是约 130GB 的数量级，随后还要考虑 VAE、激活和解码过程。[9]</w:t>
+      </w:r>
+    </w:p>
+    <w:p>
+      <w:pPr>
+        <w:pStyle w:val="Heading2"/>
+        <w:snapToGrid w:val="0"/>
+      </w:pPr>
+      <w:r>
+        <w:t>把容量按组件算清楚</w:t>
+      </w:r>
+    </w:p>
+    <w:tbl>
+      <w:tblPr>
+        <w:tblW w:w="10080" w:type="dxa"/>
+        <w:tblLayout w:type="fixed"/>
+        <w:tblBorders>
+          <w:top w:val="single" w:sz="4" w:color="D9D9D9"/>
+          <w:left w:val="single" w:sz="4" w:color="D9D9D9"/>
+          <w:bottom w:val="single" w:sz="4" w:color="D9D9D9"/>
+          <w:right w:val="single" w:sz="4" w:color="D9D9D9"/>
+          <w:insideH w:val="single" w:sz="4" w:color="D9D9D9"/>
+          <w:insideV w:val="single" w:sz="4" w:color="D9D9D9"/>
+        </w:tblBorders>
+        <w:tblCellMar>
+          <w:top w:w="100" w:type="dxa"/>
+          <w:bottom w:w="100" w:type="dxa"/>
+          <w:left w:w="100" w:type="dxa"/>
+          <w:right w:w="100" w:type="dxa"/>
+        </w:tblCellMar>
+      </w:tblPr>
+      <w:tblGrid>
+        <w:gridCol w:w="2400"/>
+        <w:gridCol w:w="5360"/>
+        <w:gridCol w:w="2320"/>
+      </w:tblGrid>
+      <w:tr>
+        <w:trPr>
+          <w:cantSplit/>
+          <w:tblHeader/>
+        </w:trPr>
+        <w:tc>
+          <w:tcPr>
+            <w:tcW w:w="2400" w:type="dxa"/>
+            <w:vAlign w:val="center"/>
+            <w:shd w:fill="18384B"/>
+          </w:tcPr>
+          <w:p>
+            <w:pPr>
+              <w:spacing w:after="0" w:line="270" w:lineRule="exact"/>
+            </w:pPr>
+            <w:r>
+              <w:rPr>
+                <w:rFonts w:ascii="Arial" w:hAnsi="Arial" w:eastAsia="Hiragino Sans GB"/>
+                <w:sz w:val="21"/>
+                <w:color w:val="FFFFFF"/>
+                <w:b/>
+              </w:rPr>
+              <w:t>组件</w:t>
+            </w:r>
+          </w:p>
+        </w:tc>
+        <w:tc>
+          <w:tcPr>
+            <w:tcW w:w="5360" w:type="dxa"/>
+            <w:vAlign w:val="center"/>
+            <w:shd w:fill="18384B"/>
+          </w:tcPr>
+          <w:p>
+            <w:pPr>
+              <w:spacing w:after="0" w:line="270" w:lineRule="exact"/>
+            </w:pPr>
+            <w:r>
+              <w:rPr>
+                <w:rFonts w:ascii="Arial" w:hAnsi="Arial" w:eastAsia="Hiragino Sans GB"/>
+                <w:sz w:val="21"/>
+                <w:color w:val="FFFFFF"/>
+                <w:b/>
+              </w:rPr>
+              <w:t>部署作用</w:t>
+            </w:r>
+          </w:p>
+        </w:tc>
+        <w:tc>
+          <w:tcPr>
+            <w:tcW w:w="2320" w:type="dxa"/>
+            <w:vAlign w:val="center"/>
+            <w:shd w:fill="18384B"/>
+          </w:tcPr>
+          <w:p>
+            <w:pPr>
+              <w:spacing w:after="0" w:line="270" w:lineRule="exact"/>
+            </w:pPr>
+            <w:r>
+              <w:rPr>
+                <w:rFonts w:ascii="Arial" w:hAnsi="Arial" w:eastAsia="Hiragino Sans GB"/>
+                <w:sz w:val="21"/>
+                <w:color w:val="FFFFFF"/>
+                <w:b/>
+              </w:rPr>
+              <w:t>固定文件容量</w:t>
+            </w:r>
+          </w:p>
+        </w:tc>
+      </w:tr>
+      <w:tr>
+        <w:trPr>
+          <w:cantSplit/>
+        </w:trPr>
+        <w:tc>
+          <w:tcPr>
+            <w:tcW w:w="2400" w:type="dxa"/>
+            <w:vAlign w:val="center"/>
+            <w:shd w:fill="FFFFFF"/>
+          </w:tcPr>
+          <w:p>
+            <w:pPr>
+              <w:spacing w:after="0" w:line="270" w:lineRule="exact"/>
+            </w:pPr>
+            <w:r>
+              <w:rPr>
+                <w:rFonts w:ascii="Arial" w:hAnsi="Arial" w:eastAsia="Hiragino Sans GB"/>
+                <w:sz w:val="21"/>
+                <w:color w:val="000000"/>
+              </w:rPr>
+              <w:t>Transformer 分支</w:t>
+            </w:r>
+          </w:p>
+        </w:tc>
+        <w:tc>
+          <w:tcPr>
+            <w:tcW w:w="5360" w:type="dxa"/>
+            <w:vAlign w:val="center"/>
+            <w:shd w:fill="FFFFFF"/>
+          </w:tcPr>
+          <w:p>
+            <w:pPr>
+              <w:spacing w:after="0" w:line="270" w:lineRule="exact"/>
+            </w:pPr>
+            <w:r>
+              <w:rPr>
+                <w:rFonts w:ascii="Arial" w:hAnsi="Arial" w:eastAsia="Hiragino Sans GB"/>
+                <w:sz w:val="21"/>
+                <w:color w:val="000000"/>
+              </w:rPr>
+              <w:t>文生或参考图工作流的主生成网络</w:t>
+            </w:r>
+          </w:p>
+        </w:tc>
+        <w:tc>
+          <w:tcPr>
+            <w:tcW w:w="2320" w:type="dxa"/>
+            <w:vAlign w:val="center"/>
+            <w:shd w:fill="FFFFFF"/>
+          </w:tcPr>
+          <w:p>
+            <w:pPr>
+              <w:spacing w:after="0" w:line="270" w:lineRule="exact"/>
+            </w:pPr>
+            <w:r>
+              <w:rPr>
+                <w:rFonts w:ascii="Arial" w:hAnsi="Arial" w:eastAsia="Hiragino Sans GB"/>
+                <w:sz w:val="21"/>
+                <w:color w:val="000000"/>
+              </w:rPr>
+              <w:t>约 61.729GiB</w:t>
+            </w:r>
+          </w:p>
+        </w:tc>
+      </w:tr>
+      <w:tr>
+        <w:trPr>
+          <w:cantSplit/>
+        </w:trPr>
+        <w:tc>
+          <w:tcPr>
+            <w:tcW w:w="2400" w:type="dxa"/>
+            <w:vAlign w:val="center"/>
+            <w:shd w:fill="F0F5F8"/>
+          </w:tcPr>
+          <w:p>
+            <w:pPr>
+              <w:spacing w:after="0" w:line="270" w:lineRule="exact"/>
+            </w:pPr>
+            <w:r>
+              <w:rPr>
+                <w:rFonts w:ascii="Arial" w:hAnsi="Arial" w:eastAsia="Hiragino Sans GB"/>
+                <w:sz w:val="21"/>
+                <w:color w:val="000000"/>
+              </w:rPr>
+              <w:t>Qwen3-VL 编码器</w:t>
+            </w:r>
+          </w:p>
+        </w:tc>
+        <w:tc>
+          <w:tcPr>
+            <w:tcW w:w="5360" w:type="dxa"/>
+            <w:vAlign w:val="center"/>
+            <w:shd w:fill="F0F5F8"/>
+          </w:tcPr>
+          <w:p>
+            <w:pPr>
+              <w:spacing w:after="0" w:line="270" w:lineRule="exact"/>
+            </w:pPr>
+            <w:r>
+              <w:rPr>
+                <w:rFonts w:ascii="Arial" w:hAnsi="Arial" w:eastAsia="Hiragino Sans GB"/>
+                <w:sz w:val="21"/>
+                <w:color w:val="000000"/>
+              </w:rPr>
+              <w:t>编码提示词和参考条件</w:t>
+            </w:r>
+          </w:p>
+        </w:tc>
+        <w:tc>
+          <w:tcPr>
+            <w:tcW w:w="2320" w:type="dxa"/>
+            <w:vAlign w:val="center"/>
+            <w:shd w:fill="F0F5F8"/>
+          </w:tcPr>
+          <w:p>
+            <w:pPr>
+              <w:spacing w:after="0" w:line="270" w:lineRule="exact"/>
+            </w:pPr>
+            <w:r>
+              <w:rPr>
+                <w:rFonts w:ascii="Arial" w:hAnsi="Arial" w:eastAsia="Hiragino Sans GB"/>
+                <w:sz w:val="21"/>
+                <w:color w:val="000000"/>
+              </w:rPr>
+              <w:t>约 62.144GiB</w:t>
+            </w:r>
+          </w:p>
+        </w:tc>
+      </w:tr>
+      <w:tr>
+        <w:trPr>
+          <w:cantSplit/>
+        </w:trPr>
+        <w:tc>
+          <w:tcPr>
+            <w:tcW w:w="2400" w:type="dxa"/>
+            <w:vAlign w:val="center"/>
+            <w:shd w:fill="FFFFFF"/>
+          </w:tcPr>
+          <w:p>
+            <w:pPr>
+              <w:spacing w:after="0" w:line="270" w:lineRule="exact"/>
+            </w:pPr>
+            <w:r>
+              <w:rPr>
+                <w:rFonts w:ascii="Arial" w:hAnsi="Arial" w:eastAsia="Hiragino Sans GB"/>
+                <w:sz w:val="21"/>
+                <w:color w:val="000000"/>
+              </w:rPr>
+              <w:t>视频 VAE</w:t>
+            </w:r>
+          </w:p>
+        </w:tc>
+        <w:tc>
+          <w:tcPr>
+            <w:tcW w:w="5360" w:type="dxa"/>
+            <w:vAlign w:val="center"/>
+            <w:shd w:fill="FFFFFF"/>
+          </w:tcPr>
+          <w:p>
+            <w:pPr>
+              <w:spacing w:after="0" w:line="270" w:lineRule="exact"/>
+            </w:pPr>
+            <w:r>
+              <w:rPr>
+                <w:rFonts w:ascii="Arial" w:hAnsi="Arial" w:eastAsia="Hiragino Sans GB"/>
+                <w:sz w:val="21"/>
+                <w:color w:val="000000"/>
+              </w:rPr>
+              <w:t>视频潜变量与画面之间转换</w:t>
+            </w:r>
+          </w:p>
+        </w:tc>
+        <w:tc>
+          <w:tcPr>
+            <w:tcW w:w="2320" w:type="dxa"/>
+            <w:vAlign w:val="center"/>
+            <w:shd w:fill="FFFFFF"/>
+          </w:tcPr>
+          <w:p>
+            <w:pPr>
+              <w:spacing w:after="0" w:line="270" w:lineRule="exact"/>
+            </w:pPr>
+            <w:r>
+              <w:rPr>
+                <w:rFonts w:ascii="Arial" w:hAnsi="Arial" w:eastAsia="Hiragino Sans GB"/>
+                <w:sz w:val="21"/>
+                <w:color w:val="000000"/>
+              </w:rPr>
+              <w:t>约 9.700GiB</w:t>
+            </w:r>
+          </w:p>
+        </w:tc>
+      </w:tr>
+      <w:tr>
+        <w:trPr>
+          <w:cantSplit/>
+        </w:trPr>
+        <w:tc>
+          <w:tcPr>
+            <w:tcW w:w="2400" w:type="dxa"/>
+            <w:vAlign w:val="center"/>
+            <w:shd w:fill="F0F5F8"/>
+          </w:tcPr>
+          <w:p>
+            <w:pPr>
+              <w:spacing w:after="0" w:line="270" w:lineRule="exact"/>
+            </w:pPr>
+            <w:r>
+              <w:rPr>
+                <w:rFonts w:ascii="Arial" w:hAnsi="Arial" w:eastAsia="Hiragino Sans GB"/>
+                <w:sz w:val="21"/>
+                <w:color w:val="000000"/>
+              </w:rPr>
+              <w:t>音频 VAE</w:t>
+            </w:r>
+          </w:p>
+        </w:tc>
+        <w:tc>
+          <w:tcPr>
+            <w:tcW w:w="5360" w:type="dxa"/>
+            <w:vAlign w:val="center"/>
+            <w:shd w:fill="F0F5F8"/>
+          </w:tcPr>
+          <w:p>
+            <w:pPr>
+              <w:spacing w:after="0" w:line="270" w:lineRule="exact"/>
+            </w:pPr>
+            <w:r>
+              <w:rPr>
+                <w:rFonts w:ascii="Arial" w:hAnsi="Arial" w:eastAsia="Hiragino Sans GB"/>
+                <w:sz w:val="21"/>
+                <w:color w:val="000000"/>
+              </w:rPr>
+              <w:t>音频潜变量与声音之间转换</w:t>
+            </w:r>
+          </w:p>
+        </w:tc>
+        <w:tc>
+          <w:tcPr>
+            <w:tcW w:w="2320" w:type="dxa"/>
+            <w:vAlign w:val="center"/>
+            <w:shd w:fill="F0F5F8"/>
+          </w:tcPr>
+          <w:p>
+            <w:pPr>
+              <w:spacing w:after="0" w:line="270" w:lineRule="exact"/>
+            </w:pPr>
+            <w:r>
+              <w:rPr>
+                <w:rFonts w:ascii="Arial" w:hAnsi="Arial" w:eastAsia="Hiragino Sans GB"/>
+                <w:sz w:val="21"/>
+                <w:color w:val="000000"/>
+              </w:rPr>
+              <w:t>约 0.564GiB</w:t>
+            </w:r>
+          </w:p>
+        </w:tc>
+      </w:tr>
+    </w:tbl>
+    <w:p>
+      <w:pPr>
+        <w:snapToGrid w:val="0"/>
+      </w:pPr>
+      <w:r>
+        <w:t>上表按本项目固定清单逐文件累加，是磁盘文件容量，用于设备容量初筛。一份 Transformer 与共享文件约 134.158GiB；本项目先保留基础分支、再补 Ref 分支，磁盘合计约 195.887GiB。单次 Ref2VA 使用其中对应的 Transformer 分支。</w:t>
+      </w:r>
+    </w:p>
+    <w:p>
+      <w:pPr>
+        <w:snapToGrid w:val="0"/>
+      </w:pPr>
+      <w:r>
+        <w:t>显存、系统内存和磁盘各解决不同问题：磁盘保存权重，显存或 RAM 承载运行张量，激活与工作区还需要余量。接下来判断设备时，我先看能否容纳所选精度和组件放置方式，再看计算速度；没有把总下载大小直接写成显存门槛。</w:t>
+      </w:r>
+    </w:p>
+    <w:p>
+      <w:pPr>
+        <w:pStyle w:val="Heading1"/>
+        <w:pageBreakBefore/>
+        <w:snapToGrid w:val="0"/>
+      </w:pPr>
+      <w:r>
+        <w:t>前期调研二 对照自己的 5060 Ti 16GB</w:t>
+      </w:r>
+    </w:p>
+    <w:p>
+      <w:pPr>
+        <w:snapToGrid w:val="0"/>
+      </w:pPr>
+      <w:r>
+        <w:t>我的 RTX 5060 Ti 是 16GB 版，NVIDIA 官方规格也列有这一配置。[13] 对照上页可见，单个完整 Transformer 的文件体积就约 61.7GiB，文本编码器又是 62.1GiB 量级。因此，直接把所选完整权重以原始精度常驻到这张显卡的部署方式，在容量上不成立。这个判断来自组件与显存的对照。</w:t>
+      </w:r>
+    </w:p>
+    <w:p>
+      <w:pPr>
+        <w:pStyle w:val="Heading2"/>
+        <w:snapToGrid w:val="0"/>
+      </w:pPr>
+      <w:r>
+        <w:t>核对不同运行配方的条件</w:t>
+      </w:r>
+    </w:p>
+    <w:tbl>
+      <w:tblPr>
+        <w:tblW w:w="10080" w:type="dxa"/>
+        <w:tblLayout w:type="fixed"/>
+        <w:tblBorders>
+          <w:top w:val="single" w:sz="4" w:color="D9D9D9"/>
+          <w:left w:val="single" w:sz="4" w:color="D9D9D9"/>
+          <w:bottom w:val="single" w:sz="4" w:color="D9D9D9"/>
+          <w:right w:val="single" w:sz="4" w:color="D9D9D9"/>
+          <w:insideH w:val="single" w:sz="4" w:color="D9D9D9"/>
+          <w:insideV w:val="single" w:sz="4" w:color="D9D9D9"/>
+        </w:tblBorders>
+        <w:tblCellMar>
+          <w:top w:w="100" w:type="dxa"/>
+          <w:bottom w:w="100" w:type="dxa"/>
+          <w:left w:w="100" w:type="dxa"/>
+          <w:right w:w="100" w:type="dxa"/>
+        </w:tblCellMar>
+      </w:tblPr>
+      <w:tblGrid>
+        <w:gridCol w:w="2080"/>
+        <w:gridCol w:w="4380"/>
+        <w:gridCol w:w="3620"/>
+      </w:tblGrid>
+      <w:tr>
+        <w:trPr>
+          <w:cantSplit/>
+          <w:tblHeader/>
+        </w:trPr>
+        <w:tc>
+          <w:tcPr>
+            <w:tcW w:w="2080" w:type="dxa"/>
+            <w:vAlign w:val="center"/>
+            <w:shd w:fill="18384B"/>
+          </w:tcPr>
+          <w:p>
+            <w:pPr>
+              <w:spacing w:after="0" w:line="270" w:lineRule="exact"/>
+            </w:pPr>
+            <w:r>
+              <w:rPr>
+                <w:rFonts w:ascii="Arial" w:hAnsi="Arial" w:eastAsia="Hiragino Sans GB"/>
+                <w:sz w:val="21"/>
+                <w:color w:val="FFFFFF"/>
+                <w:b/>
+              </w:rPr>
+              <w:t>路径</w:t>
+            </w:r>
+          </w:p>
+        </w:tc>
+        <w:tc>
+          <w:tcPr>
+            <w:tcW w:w="4380" w:type="dxa"/>
+            <w:vAlign w:val="center"/>
+            <w:shd w:fill="18384B"/>
+          </w:tcPr>
+          <w:p>
+            <w:pPr>
+              <w:spacing w:after="0" w:line="270" w:lineRule="exact"/>
+            </w:pPr>
+            <w:r>
+              <w:rPr>
+                <w:rFonts w:ascii="Arial" w:hAnsi="Arial" w:eastAsia="Hiragino Sans GB"/>
+                <w:sz w:val="21"/>
+                <w:color w:val="FFFFFF"/>
+                <w:b/>
+              </w:rPr>
+              <w:t>文档中的条件</w:t>
+            </w:r>
+          </w:p>
+        </w:tc>
+        <w:tc>
+          <w:tcPr>
+            <w:tcW w:w="3620" w:type="dxa"/>
+            <w:vAlign w:val="center"/>
+            <w:shd w:fill="18384B"/>
+          </w:tcPr>
+          <w:p>
+            <w:pPr>
+              <w:spacing w:after="0" w:line="270" w:lineRule="exact"/>
+            </w:pPr>
+            <w:r>
+              <w:rPr>
+                <w:rFonts w:ascii="Arial" w:hAnsi="Arial" w:eastAsia="Hiragino Sans GB"/>
+                <w:sz w:val="21"/>
+                <w:color w:val="FFFFFF"/>
+                <w:b/>
+              </w:rPr>
+              <w:t>对本次选择的影响</w:t>
+            </w:r>
+          </w:p>
+        </w:tc>
+      </w:tr>
+      <w:tr>
+        <w:trPr>
+          <w:cantSplit/>
+        </w:trPr>
+        <w:tc>
+          <w:tcPr>
+            <w:tcW w:w="2080" w:type="dxa"/>
+            <w:vAlign w:val="center"/>
+            <w:shd w:fill="FFFFFF"/>
+          </w:tcPr>
+          <w:p>
+            <w:pPr>
+              <w:spacing w:after="0" w:line="270" w:lineRule="exact"/>
+            </w:pPr>
+            <w:r>
+              <w:rPr>
+                <w:rFonts w:ascii="Arial" w:hAnsi="Arial" w:eastAsia="Hiragino Sans GB"/>
+                <w:sz w:val="21"/>
+                <w:color w:val="000000"/>
+              </w:rPr>
+              <w:t>完整权重 GPU</w:t>
+            </w:r>
+          </w:p>
+        </w:tc>
+        <w:tc>
+          <w:tcPr>
+            <w:tcW w:w="4380" w:type="dxa"/>
+            <w:vAlign w:val="center"/>
+            <w:shd w:fill="FFFFFF"/>
+          </w:tcPr>
+          <w:p>
+            <w:pPr>
+              <w:spacing w:after="0" w:line="270" w:lineRule="exact"/>
+            </w:pPr>
+            <w:r>
+              <w:rPr>
+                <w:rFonts w:ascii="Arial" w:hAnsi="Arial" w:eastAsia="Hiragino Sans GB"/>
+                <w:sz w:val="21"/>
+                <w:color w:val="000000"/>
+              </w:rPr>
+              <w:t>如 4×H200；或 4×H100 配合 TP/Ulysses/FSDP</w:t>
+            </w:r>
+          </w:p>
+        </w:tc>
+        <w:tc>
+          <w:tcPr>
+            <w:tcW w:w="3620" w:type="dxa"/>
+            <w:vAlign w:val="center"/>
+            <w:shd w:fill="FFFFFF"/>
+          </w:tcPr>
+          <w:p>
+            <w:pPr>
+              <w:spacing w:after="0" w:line="270" w:lineRule="exact"/>
+            </w:pPr>
+            <w:r>
+              <w:rPr>
+                <w:rFonts w:ascii="Arial" w:hAnsi="Arial" w:eastAsia="Hiragino Sans GB"/>
+                <w:sz w:val="21"/>
+                <w:color w:val="000000"/>
+              </w:rPr>
+              <w:t>体现服务器级容量与并行拓扑要求</w:t>
+            </w:r>
+          </w:p>
+        </w:tc>
+      </w:tr>
+      <w:tr>
+        <w:trPr>
+          <w:cantSplit/>
+        </w:trPr>
+        <w:tc>
+          <w:tcPr>
+            <w:tcW w:w="2080" w:type="dxa"/>
+            <w:vAlign w:val="center"/>
+            <w:shd w:fill="F0F5F8"/>
+          </w:tcPr>
+          <w:p>
+            <w:pPr>
+              <w:spacing w:after="0" w:line="270" w:lineRule="exact"/>
+            </w:pPr>
+            <w:r>
+              <w:rPr>
+                <w:rFonts w:ascii="Arial" w:hAnsi="Arial" w:eastAsia="Hiragino Sans GB"/>
+                <w:sz w:val="21"/>
+                <w:color w:val="000000"/>
+              </w:rPr>
+              <w:t>低显存 GPU</w:t>
+            </w:r>
+          </w:p>
+        </w:tc>
+        <w:tc>
+          <w:tcPr>
+            <w:tcW w:w="4380" w:type="dxa"/>
+            <w:vAlign w:val="center"/>
+            <w:shd w:fill="F0F5F8"/>
+          </w:tcPr>
+          <w:p>
+            <w:pPr>
+              <w:spacing w:after="0" w:line="270" w:lineRule="exact"/>
+            </w:pPr>
+            <w:r>
+              <w:rPr>
+                <w:rFonts w:ascii="Arial" w:hAnsi="Arial" w:eastAsia="Hiragino Sans GB"/>
+                <w:sz w:val="21"/>
+                <w:color w:val="000000"/>
+              </w:rPr>
+              <w:t>12–16GB 显存、INT8、分组或逐层卸载、小画布</w:t>
+            </w:r>
+          </w:p>
+        </w:tc>
+        <w:tc>
+          <w:tcPr>
+            <w:tcW w:w="3620" w:type="dxa"/>
+            <w:vAlign w:val="center"/>
+            <w:shd w:fill="F0F5F8"/>
+          </w:tcPr>
+          <w:p>
+            <w:pPr>
+              <w:spacing w:after="0" w:line="270" w:lineRule="exact"/>
+            </w:pPr>
+            <w:r>
+              <w:rPr>
+                <w:rFonts w:ascii="Arial" w:hAnsi="Arial" w:eastAsia="Hiragino Sans GB"/>
+                <w:sz w:val="21"/>
+                <w:color w:val="000000"/>
+              </w:rPr>
+              <w:t>需要改变精度与组件驻留方式</w:t>
+            </w:r>
+          </w:p>
+        </w:tc>
+      </w:tr>
+      <w:tr>
+        <w:trPr>
+          <w:cantSplit/>
+        </w:trPr>
+        <w:tc>
+          <w:tcPr>
+            <w:tcW w:w="2080" w:type="dxa"/>
+            <w:vAlign w:val="center"/>
+            <w:shd w:fill="FFFFFF"/>
+          </w:tcPr>
+          <w:p>
+            <w:pPr>
+              <w:spacing w:after="0" w:line="270" w:lineRule="exact"/>
+            </w:pPr>
+            <w:r>
+              <w:rPr>
+                <w:rFonts w:ascii="Arial" w:hAnsi="Arial" w:eastAsia="Hiragino Sans GB"/>
+                <w:sz w:val="21"/>
+                <w:color w:val="000000"/>
+              </w:rPr>
+              <w:t>本次纯 CPU</w:t>
+            </w:r>
+          </w:p>
+        </w:tc>
+        <w:tc>
+          <w:tcPr>
+            <w:tcW w:w="4380" w:type="dxa"/>
+            <w:vAlign w:val="center"/>
+            <w:shd w:fill="FFFFFF"/>
+          </w:tcPr>
+          <w:p>
+            <w:pPr>
+              <w:spacing w:after="0" w:line="270" w:lineRule="exact"/>
+            </w:pPr>
+            <w:r>
+              <w:rPr>
+                <w:rFonts w:ascii="Arial" w:hAnsi="Arial" w:eastAsia="Hiragino Sans GB"/>
+                <w:sz w:val="21"/>
+                <w:color w:val="000000"/>
+              </w:rPr>
+              <w:t>完整权重，BF16 主组件、FP32 双 VAE，大系统内存</w:t>
+            </w:r>
+          </w:p>
+        </w:tc>
+        <w:tc>
+          <w:tcPr>
+            <w:tcW w:w="3620" w:type="dxa"/>
+            <w:vAlign w:val="center"/>
+            <w:shd w:fill="FFFFFF"/>
+          </w:tcPr>
+          <w:p>
+            <w:pPr>
+              <w:spacing w:after="0" w:line="270" w:lineRule="exact"/>
+            </w:pPr>
+            <w:r>
+              <w:rPr>
+                <w:rFonts w:ascii="Arial" w:hAnsi="Arial" w:eastAsia="Hiragino Sans GB"/>
+                <w:sz w:val="21"/>
+                <w:color w:val="000000"/>
+              </w:rPr>
+              <w:t>利用现有可获得的云资源继续推进</w:t>
+            </w:r>
+          </w:p>
+        </w:tc>
+      </w:tr>
+    </w:tbl>
+    <w:p>
+      <w:pPr>
+        <w:snapToGrid w:val="0"/>
+      </w:pPr>
+      <w:r>
+        <w:t>SGLang 的四卡示例用于理解大模型怎样切分权重和序列，并非所有运行方式唯一的最低配置。Diffusers 还给出 12–16GB 显存的 INT8/offload 示例：Transformer 分组卸载，文本编码器与视频 VAE 逐层卸载，画布示例为 960×544，权重主要存放在约 75GB 主机 RAM 中；该示例的工作流是 T2VA。[3、11]</w:t>
+      </w:r>
+    </w:p>
+    <w:p>
+      <w:pPr>
+        <w:snapToGrid w:val="0"/>
+      </w:pPr>
+      <w:r>
+        <w:t>进一步对照配方，可以看到低显存路线还要同时改变量化、主机内存安排、画布与组件调度。我的后续目标是 768P 单图 Ref2VA，并希望保留固定版本的完整权重，于是转向查找能容纳这套模型的现有云资源。</w:t>
+      </w:r>
+    </w:p>
+    <w:p>
+      <w:pPr>
+        <w:pStyle w:val="Heading2"/>
+        <w:snapToGrid w:val="0"/>
+      </w:pPr>
+      <w:r>
+        <w:t>区分 CPU offload 和纯 CPU 推理</w:t>
+      </w:r>
+    </w:p>
+    <w:p>
+      <w:pPr>
+        <w:snapToGrid w:val="0"/>
+      </w:pPr>
+      <w:r>
+        <w:t>CPU offload 仍由 GPU 执行主体计算，只把暂时不用的权重存到系统内存并按需搬运。纯 CPU 推理则把模型组件和计算都放在 CPU 路径上。前者用传输和调度换显存，后者用大系统内存承载模型并接受更长的运行时间。这一区别决定了下一步要寻找的主机配置。</w:t>
+      </w:r>
+    </w:p>
+    <w:p>
+      <w:pPr>
+        <w:snapToGrid w:val="0"/>
+      </w:pPr>
+      <w:r>
+        <w:t>因此，我的决策链是：完整权重常驻方式超出 5060 Ti 16GB 的容量 → 查低显存配方的附加条件 → 结合 768P Ref2VA 目标与可用资源，转向云端大内存主机。</w:t>
+      </w:r>
+    </w:p>
+    <w:p>
+      <w:bookmarkStart w:id="10" w:name="gpu_cost"/>
+      <w:pPr>
+        <w:pStyle w:val="Heading1"/>
+        <w:pageBreakBefore/>
+        <w:snapToGrid w:val="0"/>
+      </w:pPr>
+      <w:r>
+        <w:t>01 评估云 GPU 的规格与成本</w:t>
       </w:r>
       <w:bookmarkEnd w:id="10"/>
     </w:p>
@@ -624,7 +1403,7 @@
         <w:rPr>
           <w:b w:val="0"/>
         </w:rPr>
-        <w:t>刚开始看 H3 时，我的第一反应也是找 GPU。真正做预算时，我发现不能只问“租一张卡多少钱”：H3 有完整的模型组件，选原始精度、量化或 CPU 卸载路线，对显存、系统内存、软件版本和等待时间的要求不同。我先选了一条容易审计的完整权重路线，没有在首次实验里同时叠加深度量化和复杂卸载优化。</w:t>
+        <w:t>本地显卡的直接部署方式被容量条件排除后，我继续看云 GPU。检查顺序是先对照 H3 配方中的显卡型号、单卡显存、卡数、互联与主机 RAM，再看公司已有云账号能否取得这类整机。低显存或卸载方案还涉及量化、精度和组件调度，不能只按“一张卡的租金”作决定。</w:t>
       </w:r>
     </w:p>
     <w:p>
@@ -644,7 +1423,7 @@
         <w:rPr>
           <w:b w:val="0"/>
         </w:rPr>
-        <w:t>下面是2026年10月20日查询到的火山引擎 ECS 定价详情：官网刊例价、华北2北京。金额是整台实例的计算资源费用，包含该实例的GPU、vCPU和内存；系统盘、数据盘、公网、付费镜像等另算。官网另有优惠价和长期购买方案，因此刊例价不代表可以获得的最低价格，具体以下单结果为准。[1、2]</w:t>
+        <w:t>以下价格是在 2026年10月20日复盘时补查，用于量化云 GPU 的成本量级；CPU 资源已于 10月18日选定并创建。口径为火山引擎官网刊例价、华北2北京，费用包含整台实例的 GPU、vCPU 和内存，云盘、公网等另计，最终按下单结果计算。[1、2]</w:t>
       </w:r>
     </w:p>
     <w:tbl>
@@ -1539,7 +2318,7 @@
         <w:snapToGrid w:val="0"/>
       </w:pPr>
       <w:r>
-        <w:t>02 有价格不代表此刻能开出资源</w:t>
+        <w:t>02 从公司可用云资源中找到 CPU 路线</w:t>
       </w:r>
       <w:bookmarkEnd w:id="19"/>
     </w:p>
@@ -1551,15 +2330,13 @@
         <w:rPr>
           <w:b w:val="0"/>
         </w:rPr>
-        <w:t>除了价格，我还需要面对可购买性：这次实验没有取得可以直接使用的合适GPU。对普通用户来说，官网列出某个机型和价格，并不保证在目标地域、可用区就能创建成功。官方FAQ明确存在“已售罄”的情形，通常需要换地域、可用区或相近规格；有些GPU还受购买条件和邀测范围限制。这些情况不能扩大成全平台长期缺货。</w:t>
+        <w:t>接下来我查看公司已有云账号中的资源入口，先看 veMLP 的开发机、资源组和队列，再扩大到 GPU ECS，并检查 VKE/VCI 能否提供可用 GPU。每一步都同时看“当前身份能否直接使用”与“目标规格能否创建”，把权限、配额和库存分开记录。</w:t>
       </w:r>
     </w:p>
     <w:tbl>
       <w:tblPr>
-        <w:tblW w:type="auto" w:w="0"/>
-        <w:jc w:val="center"/>
+        <w:tblW w:w="10080" w:type="dxa"/>
         <w:tblLayout w:type="fixed"/>
-        <w:tblLook w:firstColumn="1" w:firstRow="1" w:lastColumn="0" w:lastRow="0" w:noHBand="0" w:noVBand="1" w:val="04A0"/>
         <w:tblBorders>
           <w:top w:val="single" w:sz="4" w:color="D9D9D9"/>
           <w:left w:val="single" w:sz="4" w:color="D9D9D9"/>
@@ -1568,10 +2345,16 @@
           <w:insideH w:val="single" w:sz="4" w:color="D9D9D9"/>
           <w:insideV w:val="single" w:sz="4" w:color="D9D9D9"/>
         </w:tblBorders>
+        <w:tblCellMar>
+          <w:top w:w="100" w:type="dxa"/>
+          <w:bottom w:w="100" w:type="dxa"/>
+          <w:left w:w="100" w:type="dxa"/>
+          <w:right w:w="100" w:type="dxa"/>
+        </w:tblCellMar>
       </w:tblPr>
       <w:tblGrid>
-        <w:gridCol w:w="2016"/>
-        <w:gridCol w:w="8064"/>
+        <w:gridCol w:w="2400"/>
+        <w:gridCol w:w="7680"/>
       </w:tblGrid>
       <w:tr>
         <w:trPr>
@@ -1580,26 +2363,20 @@
         </w:trPr>
         <w:tc>
           <w:tcPr>
-            <w:tcW w:type="dxa" w:w="2016"/>
+            <w:tcW w:w="2400" w:type="dxa"/>
             <w:vAlign w:val="center"/>
-            <w:tcMar>
-              <w:top w:w="80" w:type="dxa"/>
-              <w:bottom w:w="80" w:type="dxa"/>
-              <w:left w:w="100" w:type="dxa"/>
-              <w:right w:w="100" w:type="dxa"/>
-            </w:tcMar>
-            <w:shd w:fill="18354B"/>
+            <w:shd w:fill="18384B"/>
           </w:tcPr>
           <w:p>
             <w:pPr>
-              <w:spacing w:after="0" w:line="280" w:lineRule="exact"/>
-              <w:jc w:val="center"/>
+              <w:spacing w:after="0" w:line="270" w:lineRule="exact"/>
             </w:pPr>
             <w:r>
               <w:rPr>
+                <w:rFonts w:ascii="Arial" w:hAnsi="Arial" w:eastAsia="Hiragino Sans GB"/>
+                <w:sz w:val="21"/>
+                <w:color w:val="FFFFFF"/>
                 <w:b/>
-                <w:color w:val="FFFFFF"/>
-                <w:sz w:val="21"/>
               </w:rPr>
               <w:t>检查项</w:t>
             </w:r>
@@ -1607,28 +2384,22 @@
         </w:tc>
         <w:tc>
           <w:tcPr>
-            <w:tcW w:type="dxa" w:w="8064"/>
+            <w:tcW w:w="7680" w:type="dxa"/>
             <w:vAlign w:val="center"/>
-            <w:tcMar>
-              <w:top w:w="80" w:type="dxa"/>
-              <w:bottom w:w="80" w:type="dxa"/>
-              <w:left w:w="100" w:type="dxa"/>
-              <w:right w:w="100" w:type="dxa"/>
-            </w:tcMar>
-            <w:shd w:fill="18354B"/>
+            <w:shd w:fill="18384B"/>
           </w:tcPr>
           <w:p>
             <w:pPr>
-              <w:spacing w:after="0" w:line="280" w:lineRule="exact"/>
-              <w:jc w:val="left"/>
+              <w:spacing w:after="0" w:line="270" w:lineRule="exact"/>
             </w:pPr>
             <w:r>
               <w:rPr>
+                <w:rFonts w:ascii="Arial" w:hAnsi="Arial" w:eastAsia="Hiragino Sans GB"/>
+                <w:sz w:val="21"/>
+                <w:color w:val="FFFFFF"/>
                 <w:b/>
-                <w:color w:val="FFFFFF"/>
-                <w:sz w:val="21"/>
               </w:rPr>
-              <w:t>普通用户需要确认什么</w:t>
+              <w:t>本次观察与判断</w:t>
             </w:r>
           </w:p>
         </w:tc>
@@ -1639,55 +2410,41 @@
         </w:trPr>
         <w:tc>
           <w:tcPr>
-            <w:tcW w:type="dxa" w:w="2016"/>
+            <w:tcW w:w="2400" w:type="dxa"/>
             <w:vAlign w:val="center"/>
-            <w:tcMar>
-              <w:top w:w="80" w:type="dxa"/>
-              <w:bottom w:w="80" w:type="dxa"/>
-              <w:left w:w="100" w:type="dxa"/>
-              <w:right w:w="100" w:type="dxa"/>
-            </w:tcMar>
             <w:shd w:fill="FFFFFF"/>
           </w:tcPr>
           <w:p>
             <w:pPr>
-              <w:spacing w:after="0" w:line="280" w:lineRule="exact"/>
-              <w:jc w:val="center"/>
+              <w:spacing w:after="0" w:line="270" w:lineRule="exact"/>
             </w:pPr>
             <w:r>
               <w:rPr>
-                <w:b w:val="0"/>
+                <w:rFonts w:ascii="Arial" w:hAnsi="Arial" w:eastAsia="Hiragino Sans GB"/>
+                <w:sz w:val="21"/>
                 <w:color w:val="000000"/>
-                <w:sz w:val="21"/>
               </w:rPr>
-              <w:t>购买条件</w:t>
+              <w:t>veMLP 队列与权限</w:t>
             </w:r>
           </w:p>
         </w:tc>
         <w:tc>
           <w:tcPr>
-            <w:tcW w:type="dxa" w:w="8064"/>
+            <w:tcW w:w="7680" w:type="dxa"/>
             <w:vAlign w:val="center"/>
-            <w:tcMar>
-              <w:top w:w="80" w:type="dxa"/>
-              <w:bottom w:w="80" w:type="dxa"/>
-              <w:left w:w="100" w:type="dxa"/>
-              <w:right w:w="100" w:type="dxa"/>
-            </w:tcMar>
             <w:shd w:fill="FFFFFF"/>
           </w:tcPr>
           <w:p>
             <w:pPr>
-              <w:spacing w:after="0" w:line="280" w:lineRule="exact"/>
-              <w:jc w:val="left"/>
+              <w:spacing w:after="0" w:line="270" w:lineRule="exact"/>
             </w:pPr>
             <w:r>
               <w:rPr>
-                <w:b w:val="0"/>
+                <w:rFonts w:ascii="Arial" w:hAnsi="Arial" w:eastAsia="Hiragino Sans GB"/>
+                <w:sz w:val="21"/>
                 <w:color w:val="000000"/>
-                <w:sz w:val="21"/>
               </w:rPr>
-              <w:t>高性能计算GPU型的官方购买说明要求企业认证；不能把这一限制扩大成所有GPU都仅对企业开放</w:t>
+              <w:t>有 GPU 额度展示，但遇到申请加入队列、开发机权限或跨服务授权提示，也有空队列情况</w:t>
             </w:r>
           </w:p>
         </w:tc>
@@ -1698,55 +2455,41 @@
         </w:trPr>
         <w:tc>
           <w:tcPr>
-            <w:tcW w:type="dxa" w:w="2016"/>
+            <w:tcW w:w="2400" w:type="dxa"/>
             <w:vAlign w:val="center"/>
-            <w:tcMar>
-              <w:top w:w="80" w:type="dxa"/>
-              <w:bottom w:w="80" w:type="dxa"/>
-              <w:left w:w="100" w:type="dxa"/>
-              <w:right w:w="100" w:type="dxa"/>
-            </w:tcMar>
-            <w:shd w:fill="F1F5F8"/>
+            <w:shd w:fill="F0F5F8"/>
           </w:tcPr>
           <w:p>
             <w:pPr>
-              <w:spacing w:after="0" w:line="280" w:lineRule="exact"/>
-              <w:jc w:val="center"/>
+              <w:spacing w:after="0" w:line="270" w:lineRule="exact"/>
             </w:pPr>
             <w:r>
               <w:rPr>
-                <w:b w:val="0"/>
+                <w:rFonts w:ascii="Arial" w:hAnsi="Arial" w:eastAsia="Hiragino Sans GB"/>
+                <w:sz w:val="21"/>
                 <w:color w:val="000000"/>
-                <w:sz w:val="21"/>
               </w:rPr>
-              <w:t>邀测状态</w:t>
+              <w:t>ECS GPU 库存</w:t>
             </w:r>
           </w:p>
         </w:tc>
         <w:tc>
           <w:tcPr>
-            <w:tcW w:type="dxa" w:w="8064"/>
+            <w:tcW w:w="7680" w:type="dxa"/>
             <w:vAlign w:val="center"/>
-            <w:tcMar>
-              <w:top w:w="80" w:type="dxa"/>
-              <w:bottom w:w="80" w:type="dxa"/>
-              <w:left w:w="100" w:type="dxa"/>
-              <w:right w:w="100" w:type="dxa"/>
-            </w:tcMar>
-            <w:shd w:fill="F1F5F8"/>
+            <w:shd w:fill="F0F5F8"/>
           </w:tcPr>
           <w:p>
             <w:pPr>
-              <w:spacing w:after="0" w:line="280" w:lineRule="exact"/>
-              <w:jc w:val="left"/>
+              <w:spacing w:after="0" w:line="270" w:lineRule="exact"/>
             </w:pPr>
             <w:r>
               <w:rPr>
-                <w:b w:val="0"/>
+                <w:rFonts w:ascii="Arial" w:hAnsi="Arial" w:eastAsia="Hiragino Sans GB"/>
+                <w:sz w:val="21"/>
                 <w:color w:val="000000"/>
-                <w:sz w:val="21"/>
               </w:rPr>
-              <w:t>部分较新GPU系列或特定高性能系列仍处于邀测，价格和规格介绍不等于已经全面开放购买</w:t>
+              <w:t>所查部分 A100、A10、HPC 等规格显示售罄或无可用区；换产品入口不能直接获得这些卡</w:t>
             </w:r>
           </w:p>
         </w:tc>
@@ -1757,55 +2500,41 @@
         </w:trPr>
         <w:tc>
           <w:tcPr>
-            <w:tcW w:type="dxa" w:w="2016"/>
+            <w:tcW w:w="2400" w:type="dxa"/>
             <w:vAlign w:val="center"/>
-            <w:tcMar>
-              <w:top w:w="80" w:type="dxa"/>
-              <w:bottom w:w="80" w:type="dxa"/>
-              <w:left w:w="100" w:type="dxa"/>
-              <w:right w:w="100" w:type="dxa"/>
-            </w:tcMar>
             <w:shd w:fill="FFFFFF"/>
           </w:tcPr>
           <w:p>
             <w:pPr>
-              <w:spacing w:after="0" w:line="280" w:lineRule="exact"/>
-              <w:jc w:val="center"/>
+              <w:spacing w:after="0" w:line="270" w:lineRule="exact"/>
             </w:pPr>
             <w:r>
               <w:rPr>
-                <w:b w:val="0"/>
+                <w:rFonts w:ascii="Arial" w:hAnsi="Arial" w:eastAsia="Hiragino Sans GB"/>
+                <w:sz w:val="21"/>
                 <w:color w:val="000000"/>
-                <w:sz w:val="21"/>
               </w:rPr>
-              <w:t>配额</w:t>
+              <w:t>可选 V100 与 T4</w:t>
             </w:r>
           </w:p>
         </w:tc>
         <w:tc>
           <w:tcPr>
-            <w:tcW w:type="dxa" w:w="8064"/>
+            <w:tcW w:w="7680" w:type="dxa"/>
             <w:vAlign w:val="center"/>
-            <w:tcMar>
-              <w:top w:w="80" w:type="dxa"/>
-              <w:bottom w:w="80" w:type="dxa"/>
-              <w:left w:w="100" w:type="dxa"/>
-              <w:right w:w="100" w:type="dxa"/>
-            </w:tcMar>
             <w:shd w:fill="FFFFFF"/>
           </w:tcPr>
           <w:p>
             <w:pPr>
-              <w:spacing w:after="0" w:line="280" w:lineRule="exact"/>
-              <w:jc w:val="left"/>
+              <w:spacing w:after="0" w:line="270" w:lineRule="exact"/>
             </w:pPr>
             <w:r>
               <w:rPr>
-                <w:b w:val="0"/>
+                <w:rFonts w:ascii="Arial" w:hAnsi="Arial" w:eastAsia="Hiragino Sans GB"/>
+                <w:sz w:val="21"/>
                 <w:color w:val="000000"/>
-                <w:sz w:val="21"/>
               </w:rPr>
-              <w:t>配额可能按地域、可用区、计费方式和规格族区分；额度不足和库存不足是不同问题</w:t>
+              <w:t>部分创建表单可选，但整机 RAM 与精度条件仍需对照模型配方，不能只看显存</w:t>
             </w:r>
           </w:p>
         </w:tc>
@@ -1816,55 +2545,41 @@
         </w:trPr>
         <w:tc>
           <w:tcPr>
-            <w:tcW w:type="dxa" w:w="2016"/>
+            <w:tcW w:w="2400" w:type="dxa"/>
             <w:vAlign w:val="center"/>
-            <w:tcMar>
-              <w:top w:w="80" w:type="dxa"/>
-              <w:bottom w:w="80" w:type="dxa"/>
-              <w:left w:w="100" w:type="dxa"/>
-              <w:right w:w="100" w:type="dxa"/>
-            </w:tcMar>
-            <w:shd w:fill="F1F5F8"/>
+            <w:shd w:fill="F0F5F8"/>
           </w:tcPr>
           <w:p>
             <w:pPr>
-              <w:spacing w:after="0" w:line="280" w:lineRule="exact"/>
-              <w:jc w:val="center"/>
+              <w:spacing w:after="0" w:line="270" w:lineRule="exact"/>
             </w:pPr>
             <w:r>
               <w:rPr>
-                <w:b w:val="0"/>
+                <w:rFonts w:ascii="Arial" w:hAnsi="Arial" w:eastAsia="Hiragino Sans GB"/>
+                <w:sz w:val="21"/>
                 <w:color w:val="000000"/>
-                <w:sz w:val="21"/>
               </w:rPr>
-              <w:t>可用区库存</w:t>
+              <w:t>VKE 与 VCI</w:t>
             </w:r>
           </w:p>
         </w:tc>
         <w:tc>
           <w:tcPr>
-            <w:tcW w:type="dxa" w:w="8064"/>
+            <w:tcW w:w="7680" w:type="dxa"/>
             <w:vAlign w:val="center"/>
-            <w:tcMar>
-              <w:top w:w="80" w:type="dxa"/>
-              <w:bottom w:w="80" w:type="dxa"/>
-              <w:left w:w="100" w:type="dxa"/>
-              <w:right w:w="100" w:type="dxa"/>
-            </w:tcMar>
-            <w:shd w:fill="F1F5F8"/>
+            <w:shd w:fill="F0F5F8"/>
           </w:tcPr>
           <w:p>
             <w:pPr>
-              <w:spacing w:after="0" w:line="280" w:lineRule="exact"/>
-              <w:jc w:val="left"/>
+              <w:spacing w:after="0" w:line="270" w:lineRule="exact"/>
             </w:pPr>
             <w:r>
               <w:rPr>
-                <w:b w:val="0"/>
+                <w:rFonts w:ascii="Arial" w:hAnsi="Arial" w:eastAsia="Hiragino Sans GB"/>
+                <w:sz w:val="21"/>
                 <w:color w:val="000000"/>
-                <w:sz w:val="21"/>
               </w:rPr>
-              <w:t>同一规格在不同地域或可用区可能有不同库存；官网FAQ明确存在“已售罄”的场景</w:t>
+              <w:t>集群、工作负载或额度展示不能替代实际可分配的 GPU 节点</w:t>
             </w:r>
           </w:p>
         </w:tc>
@@ -1875,55 +2590,41 @@
         </w:trPr>
         <w:tc>
           <w:tcPr>
-            <w:tcW w:type="dxa" w:w="2016"/>
+            <w:tcW w:w="2400" w:type="dxa"/>
             <w:vAlign w:val="center"/>
-            <w:tcMar>
-              <w:top w:w="80" w:type="dxa"/>
-              <w:bottom w:w="80" w:type="dxa"/>
-              <w:left w:w="100" w:type="dxa"/>
-              <w:right w:w="100" w:type="dxa"/>
-            </w:tcMar>
             <w:shd w:fill="FFFFFF"/>
           </w:tcPr>
           <w:p>
             <w:pPr>
-              <w:spacing w:after="0" w:line="280" w:lineRule="exact"/>
-              <w:jc w:val="center"/>
+              <w:spacing w:after="0" w:line="270" w:lineRule="exact"/>
             </w:pPr>
             <w:r>
               <w:rPr>
-                <w:b w:val="0"/>
+                <w:rFonts w:ascii="Arial" w:hAnsi="Arial" w:eastAsia="Hiragino Sans GB"/>
+                <w:sz w:val="21"/>
                 <w:color w:val="000000"/>
-                <w:sz w:val="21"/>
               </w:rPr>
-              <w:t>价格口径</w:t>
+              <w:t>大内存 CPU ECS</w:t>
             </w:r>
           </w:p>
         </w:tc>
         <w:tc>
           <w:tcPr>
-            <w:tcW w:type="dxa" w:w="8064"/>
+            <w:tcW w:w="7680" w:type="dxa"/>
             <w:vAlign w:val="center"/>
-            <w:tcMar>
-              <w:top w:w="80" w:type="dxa"/>
-              <w:bottom w:w="80" w:type="dxa"/>
-              <w:left w:w="100" w:type="dxa"/>
-              <w:right w:w="100" w:type="dxa"/>
-            </w:tcMar>
             <w:shd w:fill="FFFFFF"/>
           </w:tcPr>
           <w:p>
             <w:pPr>
-              <w:spacing w:after="0" w:line="280" w:lineRule="exact"/>
-              <w:jc w:val="left"/>
+              <w:spacing w:after="0" w:line="270" w:lineRule="exact"/>
             </w:pPr>
             <w:r>
               <w:rPr>
-                <w:b w:val="0"/>
+                <w:rFonts w:ascii="Arial" w:hAnsi="Arial" w:eastAsia="Hiragino Sans GB"/>
+                <w:sz w:val="21"/>
                 <w:color w:val="000000"/>
-                <w:sz w:val="21"/>
               </w:rPr>
-              <w:t>公开价只是参考，最终可购买规格和费用以下单页为准；表单可选不等于已经创建成功</w:t>
+              <w:t>现有授权下能够创建 160 vCPU、768GiB 内存的实例，提供了可落实的模型承载方案</w:t>
             </w:r>
           </w:p>
         </w:tc>
@@ -1953,7 +2654,7 @@
         <w:rPr>
           <w:b w:val="0"/>
         </w:rPr>
-        <w:t>这些限制都有面向普通用户的公开说明：高性能GPU购买条件、资源配额、可购买地域与售罄FAQ分别处理不同问题。预算足够，并不能保证想要的高显存整机在目标地域立即可用。[4、5、6、7]</w:t>
+        <w:t>遇到加入队列和跨服务授权时，我没有提交新的权限申请，而是继续筛选已有授权能直接使用的资源。GPU 库存与限制反映的是本次查询范围和时间；公开购买条件、配额与售罄说明用于辅助理解这些结果。[4、5、6、7]</w:t>
       </w:r>
     </w:p>
     <w:p>
@@ -1962,7 +2663,7 @@
         <w:snapToGrid w:val="0"/>
       </w:pPr>
       <w:r>
-        <w:t>为什么没有继续换一个平台入口</w:t>
+        <w:t>为什么最终落到 CPU ECS</w:t>
       </w:r>
     </w:p>
     <w:p>
@@ -1973,7 +2674,7 @@
         <w:rPr>
           <w:b w:val="0"/>
         </w:rPr>
-        <w:t>我最初考虑过veMLP开发机。它适合在平台化环境里管理镜像、队列和开发过程，但底层仍然要有实际算力。GPU ECS则让我更直接地控制操作系统、驱动和存储。VKE等容器平台能组织资源，也不会因为换了界面就增加可用GPU。</w:t>
+        <w:t>veMLP 适合管理镜像、开发环境和资源队列；ECS 可以直接控制操作系统与存储；VKE/VCI 提供容器运行入口。我需要的是实际可分配的计算资源，因此继续对照整机配置。最终发现公司可用账号能开出大核数、大内存 CPU，内存容量首先解决了模型承载问题。</w:t>
       </w:r>
     </w:p>
     <w:p>
@@ -1984,7 +2685,7 @@
         <w:rPr>
           <w:b w:val="0"/>
         </w:rPr>
-        <w:t>因此，我把这次实验的前提固定下来：没有可直接使用的合适GPU，不为了第一轮验证追加高显存多卡租用预算。接下来先用能配置的大内存CPU ECS，回答“完整模型链路能否跑通”。这比同时排查GPU架构、驱动、量化和平台调度更容易解释结果。</w:t>
+        <w:t>2026年10月18日，我创建了 160 vCPU、768GiB 的 CPU ECS，配 80GiB 系统盘和 500GiB 数据盘。进入机器后确认是 80 物理核、160 线程与 2 NUMA。到这一步，CPU 才成为具体部署选择：先用容量余量装下模型，再以环境检查、短任务和完整生成逐步落实。</w:t>
       </w:r>
     </w:p>
     <w:p>
@@ -1995,7 +2696,7 @@
         <w:snapToGrid w:val="0"/>
       </w:pPr>
       <w:r>
-        <w:t>03 我到底要验证 H3 的哪一种能力</w:t>
+        <w:t>03 确定 CPU 执行框架与主机规格</w:t>
       </w:r>
       <w:bookmarkEnd w:id="26"/>
     </w:p>
@@ -2007,7 +2708,7 @@
         <w:rPr>
           <w:b w:val="0"/>
         </w:rPr>
-        <w:t>我想做的是参考图生成音视频：给模型一张人物或角色参考，再用提示词安排新的场景与动作。参考图不必是视频第0帧，也不要求一模一样地复制原照片背景。这个目标对应Ref2VA。</w:t>
+        <w:t>CPU 路线确定后，生成目标进一步明确为单图 Ref2VA：输入人物或角色参考图，用提示词安排新的场景与动作。参考图作为条件，不固定为视频第0帧。后续围绕对应 Transformer 分支、共享编码器和双 VAE 准备运行环境。</w:t>
       </w:r>
     </w:p>
     <w:tbl>
@@ -2829,7 +3530,7 @@
         <w:rPr>
           <w:b w:val="0"/>
         </w:rPr>
-        <w:t>这里用的是大内存服务器，不是普通笔记本。768GiB配置给我留下了较大余量；它并不证明每个人都必须购买同样规格。160vCPU也不等于160个物理核。实测RSS来自特定请求，不能直接当作所有H3任务的最低内存要求。</w:t>
+        <w:t>768GiB 系统内存为模型加载、激活和解码留下容量余量；80 个物理核用于推进 CPU 计算。容量决定能否承载，核数影响执行效率，二者分别检查。后续实测 RSS 为具体请求的进程用量，主机选型还要考虑系统与其他任务占用。</w:t>
       </w:r>
     </w:p>
     <w:p>
@@ -6352,7 +7053,7 @@
         <w:rPr>
           <w:b w:val="0"/>
         </w:rPr>
-        <w:t>我的选择是在没有合适GPU、且希望先验证完整链路的前提下做一次离线实验。若目标是持续生成视频，应该把GPU短租、托管API和CPU三条路线放到相同质量目标下，比较总费用、等待时间和运维负担。</w:t>
+        <w:t>模型与显卡评估、云资源筛选之后，我选择用大内存 CPU 完成这次部署。若目标是持续生成视频，应把 GPU 短租、托管 API 和 CPU 三条路线放到相同质量目标下，比较总费用、等待时间和运维负担。</w:t>
       </w:r>
     </w:p>
     <w:p>
@@ -6531,7 +7232,7 @@
                 <w:color w:val="000000"/>
                 <w:sz w:val="20"/>
               </w:rPr>
-              <w:t>先确认有没有可用GPU，能接受多久等待，以及完整实验的预算</w:t>
+              <w:t>先列出模型目标与硬件条件，再对照可用设备、等待时间和完整实验预算</w:t>
             </w:r>
           </w:p>
         </w:tc>
@@ -7187,7 +7888,7 @@
         <w:rPr>
           <w:b w:val="0"/>
         </w:rPr>
-        <w:t>我最初想知道的是“没有GPU是否就不能部署H3”。现在可以更准确地回答：在这台高内存CPU机器和固定软件版本上，完整单图Ref2VA确实能够生成音视频，核心生成能力没有因为执行设备是CPU就自动消失。代价是长时间等待，以及仍然可观的云资源费用。</w:t>
+        <w:t>完成模型要求与自有显卡评估后，我进一步确认了大内存 CPU 能否承载完整 H3 生成。在这台高内存 CPU 机器和固定软件版本上，完整单图 Ref2VA 能够生成音视频；模型容量与 CPU 执行路径都已落实，代价是长时间等待，以及仍然可观的云资源费用。</w:t>
       </w:r>
     </w:p>
     <w:tbl>
@@ -12698,6 +13399,34 @@
           <w:sz w:val="19"/>
         </w:rPr>
         <w:t>网页版对嵌入对象的支持不同，应同时保留独立MP4。</w:t>
+      </w:r>
+    </w:p>
+    <w:p>
+      <w:pPr>
+        <w:keepNext/>
+        <w:spacing w:after="60"/>
+        <w:snapToGrid w:val="0"/>
+      </w:pPr>
+      <w:r>
+        <w:rPr>
+          <w:b w:val="0"/>
+        </w:rPr>
+      </w:r>
+      <w:hyperlink r:id="rId33">
+        <w:r>
+          <w:rPr>
+            <w:color w:val="17365D"/>
+          </w:rPr>
+          <w:t>13 NVIDIA GeForce RTX 5060 Ti 官方规格</w:t>
+        </w:r>
+      </w:hyperlink>
+    </w:p>
+    <w:p>
+      <w:pPr>
+        <w:snapToGrid w:val="0"/>
+      </w:pPr>
+      <w:r>
+        <w:t>标准显存配置为 16GB 或 8GB GDDR7；本文按自有显卡的 16GB 版评估。</w:t>
       </w:r>
     </w:p>
     <w:tbl>

</xml_diff>

<commit_message>
docs: add detailed H3 GPU selection and memory planning
</commit_message>
<xml_diff>
--- a/docs/Minimax H3部署方案.docx
+++ b/docs/Minimax H3部署方案.docx
@@ -1381,6 +1381,1640 @@
       </w:pPr>
       <w:r>
         <w:t>因此，我的决策链是：完整权重常驻方式超出 5060 Ti 16GB 的容量 → 查低显存配方的附加条件 → 结合 768P Ref2VA 目标与可用资源，转向云端大内存主机。</w:t>
+      </w:r>
+    </w:p>
+    <w:p>
+      <w:pPr>
+        <w:pStyle w:val="Heading1"/>
+        <w:pageBreakBefore/>
+        <w:snapToGrid w:val="0"/>
+      </w:pPr>
+      <w:r>
+        <w:t>GPU 选型一 企业级显卡与卡数</w:t>
+      </w:r>
+    </w:p>
+    <w:p>
+      <w:pPr>
+        <w:snapToGrid w:val="0"/>
+      </w:pPr>
+      <w:r>
+        <w:t>即使本项目最后使用 CPU，GPU 仍有完整的选型路径。先确定精度和组件放置方式，再选单卡容量与卡数。H3 的输入编码器基于 Qwen3-VL-32B，它与 H3 主生成网络一起组成推理系统；约 61.7GiB 的 Transformer、62.1GiB 的编码器和双 VAE 都应进入容量预算。[3、9、11]</w:t>
+      </w:r>
+    </w:p>
+    <w:p>
+      <w:pPr>
+        <w:pStyle w:val="Heading2"/>
+        <w:snapToGrid w:val="0"/>
+      </w:pPr>
+      <w:r>
+        <w:t>企业级 GPU 可以怎样选</w:t>
+      </w:r>
+    </w:p>
+    <w:tbl>
+      <w:tblPr>
+        <w:tblW w:w="10080" w:type="dxa"/>
+        <w:tblLayout w:type="fixed"/>
+        <w:tblBorders>
+          <w:top w:val="single" w:sz="4" w:color="D9D9D9"/>
+          <w:left w:val="single" w:sz="4" w:color="D9D9D9"/>
+          <w:bottom w:val="single" w:sz="4" w:color="D9D9D9"/>
+          <w:right w:val="single" w:sz="4" w:color="D9D9D9"/>
+          <w:insideH w:val="single" w:sz="4" w:color="D9D9D9"/>
+          <w:insideV w:val="single" w:sz="4" w:color="D9D9D9"/>
+        </w:tblBorders>
+        <w:tblCellMar>
+          <w:top w:w="100" w:type="dxa"/>
+          <w:bottom w:w="100" w:type="dxa"/>
+          <w:left w:w="100" w:type="dxa"/>
+          <w:right w:w="100" w:type="dxa"/>
+        </w:tblCellMar>
+      </w:tblPr>
+      <w:tblGrid>
+        <w:gridCol w:w="2520"/>
+        <w:gridCol w:w="4460"/>
+        <w:gridCol w:w="3100"/>
+      </w:tblGrid>
+      <w:tr>
+        <w:trPr>
+          <w:cantSplit/>
+          <w:tblHeader/>
+        </w:trPr>
+        <w:tc>
+          <w:tcPr>
+            <w:tcW w:w="2520" w:type="dxa"/>
+            <w:vAlign w:val="center"/>
+            <w:shd w:fill="18384B"/>
+          </w:tcPr>
+          <w:p>
+            <w:pPr>
+              <w:spacing w:after="0" w:line="270" w:lineRule="exact"/>
+            </w:pPr>
+            <w:r>
+              <w:rPr>
+                <w:rFonts w:ascii="Arial" w:hAnsi="Arial" w:eastAsia="Hiragino Sans GB"/>
+                <w:sz w:val="21"/>
+                <w:color w:val="FFFFFF"/>
+                <w:b/>
+              </w:rPr>
+              <w:t>GPU 配置</w:t>
+            </w:r>
+          </w:p>
+        </w:tc>
+        <w:tc>
+          <w:tcPr>
+            <w:tcW w:w="4460" w:type="dxa"/>
+            <w:vAlign w:val="center"/>
+            <w:shd w:fill="18384B"/>
+          </w:tcPr>
+          <w:p>
+            <w:pPr>
+              <w:spacing w:after="0" w:line="270" w:lineRule="exact"/>
+            </w:pPr>
+            <w:r>
+              <w:rPr>
+                <w:rFonts w:ascii="Arial" w:hAnsi="Arial" w:eastAsia="Hiragino Sans GB"/>
+                <w:sz w:val="21"/>
+                <w:color w:val="FFFFFF"/>
+                <w:b/>
+              </w:rPr>
+              <w:t>精度与执行方式</w:t>
+            </w:r>
+          </w:p>
+        </w:tc>
+        <w:tc>
+          <w:tcPr>
+            <w:tcW w:w="3100" w:type="dxa"/>
+            <w:vAlign w:val="center"/>
+            <w:shd w:fill="18384B"/>
+          </w:tcPr>
+          <w:p>
+            <w:pPr>
+              <w:spacing w:after="0" w:line="270" w:lineRule="exact"/>
+            </w:pPr>
+            <w:r>
+              <w:rPr>
+                <w:rFonts w:ascii="Arial" w:hAnsi="Arial" w:eastAsia="Hiragino Sans GB"/>
+                <w:sz w:val="21"/>
+                <w:color w:val="FFFFFF"/>
+                <w:b/>
+              </w:rPr>
+              <w:t>选择依据</w:t>
+            </w:r>
+          </w:p>
+        </w:tc>
+      </w:tr>
+      <w:tr>
+        <w:trPr>
+          <w:cantSplit/>
+        </w:trPr>
+        <w:tc>
+          <w:tcPr>
+            <w:tcW w:w="2520" w:type="dxa"/>
+            <w:vAlign w:val="center"/>
+            <w:shd w:fill="FFFFFF"/>
+          </w:tcPr>
+          <w:p>
+            <w:pPr>
+              <w:spacing w:after="0" w:line="270" w:lineRule="exact"/>
+            </w:pPr>
+            <w:r>
+              <w:rPr>
+                <w:rFonts w:ascii="Arial" w:hAnsi="Arial" w:eastAsia="Hiragino Sans GB"/>
+                <w:sz w:val="21"/>
+                <w:color w:val="000000"/>
+              </w:rPr>
+              <w:t>1×80GB
+H100 或 A100 80GB</w:t>
+            </w:r>
+          </w:p>
+        </w:tc>
+        <w:tc>
+          <w:tcPr>
+            <w:tcW w:w="4460" w:type="dxa"/>
+            <w:vAlign w:val="center"/>
+            <w:shd w:fill="FFFFFF"/>
+          </w:tcPr>
+          <w:p>
+            <w:pPr>
+              <w:spacing w:after="0" w:line="270" w:lineRule="exact"/>
+            </w:pPr>
+            <w:r>
+              <w:rPr>
+                <w:rFonts w:ascii="Arial" w:hAnsi="Arial" w:eastAsia="Hiragino Sans GB"/>
+                <w:sz w:val="21"/>
+                <w:color w:val="000000"/>
+              </w:rPr>
+              <w:t>Diffusers：BF16，ComponentsManager 按组件 CPU offload，示例预留12GB显存</w:t>
+            </w:r>
+          </w:p>
+        </w:tc>
+        <w:tc>
+          <w:tcPr>
+            <w:tcW w:w="3100" w:type="dxa"/>
+            <w:vAlign w:val="center"/>
+            <w:shd w:fill="FFFFFF"/>
+          </w:tcPr>
+          <w:p>
+            <w:pPr>
+              <w:spacing w:after="0" w:line="270" w:lineRule="exact"/>
+            </w:pPr>
+            <w:r>
+              <w:rPr>
+                <w:rFonts w:ascii="Arial" w:hAnsi="Arial" w:eastAsia="Hiragino Sans GB"/>
+                <w:sz w:val="21"/>
+                <w:color w:val="000000"/>
+              </w:rPr>
+              <w:t>希望减少卡数，并接受权重在 CPU 与 GPU 间搬运</w:t>
+            </w:r>
+          </w:p>
+        </w:tc>
+      </w:tr>
+      <w:tr>
+        <w:trPr>
+          <w:cantSplit/>
+        </w:trPr>
+        <w:tc>
+          <w:tcPr>
+            <w:tcW w:w="2520" w:type="dxa"/>
+            <w:vAlign w:val="center"/>
+            <w:shd w:fill="F0F5F8"/>
+          </w:tcPr>
+          <w:p>
+            <w:pPr>
+              <w:spacing w:after="0" w:line="270" w:lineRule="exact"/>
+            </w:pPr>
+            <w:r>
+              <w:rPr>
+                <w:rFonts w:ascii="Arial" w:hAnsi="Arial" w:eastAsia="Hiragino Sans GB"/>
+                <w:sz w:val="21"/>
+                <w:color w:val="000000"/>
+              </w:rPr>
+              <w:t>2×80GB
+H100 或 A100 80GB</w:t>
+            </w:r>
+          </w:p>
+        </w:tc>
+        <w:tc>
+          <w:tcPr>
+            <w:tcW w:w="4460" w:type="dxa"/>
+            <w:vAlign w:val="center"/>
+            <w:shd w:fill="F0F5F8"/>
+          </w:tcPr>
+          <w:p>
+            <w:pPr>
+              <w:spacing w:after="0" w:line="270" w:lineRule="exact"/>
+            </w:pPr>
+            <w:r>
+              <w:rPr>
+                <w:rFonts w:ascii="Arial" w:hAnsi="Arial" w:eastAsia="Hiragino Sans GB"/>
+                <w:sz w:val="21"/>
+                <w:color w:val="000000"/>
+              </w:rPr>
+              <w:t>Diffusers：BF16；Qwen 编码器一张卡，生成组件另一张卡，按组件拆分</w:t>
+            </w:r>
+          </w:p>
+        </w:tc>
+        <w:tc>
+          <w:tcPr>
+            <w:tcW w:w="3100" w:type="dxa"/>
+            <w:vAlign w:val="center"/>
+            <w:shd w:fill="F0F5F8"/>
+          </w:tcPr>
+          <w:p>
+            <w:pPr>
+              <w:spacing w:after="0" w:line="270" w:lineRule="exact"/>
+            </w:pPr>
+            <w:r>
+              <w:rPr>
+                <w:rFonts w:ascii="Arial" w:hAnsi="Arial" w:eastAsia="Hiragino Sans GB"/>
+                <w:sz w:val="21"/>
+                <w:color w:val="000000"/>
+              </w:rPr>
+              <w:t>兼顾原精度和卡数；这是分组件放置，不是显存自动合并</w:t>
+            </w:r>
+          </w:p>
+        </w:tc>
+      </w:tr>
+      <w:tr>
+        <w:trPr>
+          <w:cantSplit/>
+        </w:trPr>
+        <w:tc>
+          <w:tcPr>
+            <w:tcW w:w="2520" w:type="dxa"/>
+            <w:vAlign w:val="center"/>
+            <w:shd w:fill="FFFFFF"/>
+          </w:tcPr>
+          <w:p>
+            <w:pPr>
+              <w:spacing w:after="0" w:line="270" w:lineRule="exact"/>
+            </w:pPr>
+            <w:r>
+              <w:rPr>
+                <w:rFonts w:ascii="Arial" w:hAnsi="Arial" w:eastAsia="Hiragino Sans GB"/>
+                <w:sz w:val="21"/>
+                <w:color w:val="000000"/>
+              </w:rPr>
+              <w:t>4×H100 80GB</w:t>
+            </w:r>
+          </w:p>
+        </w:tc>
+        <w:tc>
+          <w:tcPr>
+            <w:tcW w:w="4460" w:type="dxa"/>
+            <w:vAlign w:val="center"/>
+            <w:shd w:fill="FFFFFF"/>
+          </w:tcPr>
+          <w:p>
+            <w:pPr>
+              <w:spacing w:after="0" w:line="270" w:lineRule="exact"/>
+            </w:pPr>
+            <w:r>
+              <w:rPr>
+                <w:rFonts w:ascii="Arial" w:hAnsi="Arial" w:eastAsia="Hiragino Sans GB"/>
+                <w:sz w:val="21"/>
+                <w:color w:val="000000"/>
+              </w:rPr>
+              <w:t>SGLang：BF16/FP32 常驻，TP2＋Ulysses2，encoder auto</w:t>
+            </w:r>
+          </w:p>
+        </w:tc>
+        <w:tc>
+          <w:tcPr>
+            <w:tcW w:w="3100" w:type="dxa"/>
+            <w:vAlign w:val="center"/>
+            <w:shd w:fill="FFFFFF"/>
+          </w:tcPr>
+          <w:p>
+            <w:pPr>
+              <w:spacing w:after="0" w:line="270" w:lineRule="exact"/>
+            </w:pPr>
+            <w:r>
+              <w:rPr>
+                <w:rFonts w:ascii="Arial" w:hAnsi="Arial" w:eastAsia="Hiragino Sans GB"/>
+                <w:sz w:val="21"/>
+                <w:color w:val="000000"/>
+              </w:rPr>
+              <w:t>80GB 企业卡的服务配方；权重与序列共同切分</w:t>
+            </w:r>
+          </w:p>
+        </w:tc>
+      </w:tr>
+      <w:tr>
+        <w:trPr>
+          <w:cantSplit/>
+        </w:trPr>
+        <w:tc>
+          <w:tcPr>
+            <w:tcW w:w="2520" w:type="dxa"/>
+            <w:vAlign w:val="center"/>
+            <w:shd w:fill="F0F5F8"/>
+          </w:tcPr>
+          <w:p>
+            <w:pPr>
+              <w:spacing w:after="0" w:line="270" w:lineRule="exact"/>
+            </w:pPr>
+            <w:r>
+              <w:rPr>
+                <w:rFonts w:ascii="Arial" w:hAnsi="Arial" w:eastAsia="Hiragino Sans GB"/>
+                <w:sz w:val="21"/>
+                <w:color w:val="000000"/>
+              </w:rPr>
+              <w:t>4×H200 141GB</w:t>
+            </w:r>
+          </w:p>
+        </w:tc>
+        <w:tc>
+          <w:tcPr>
+            <w:tcW w:w="4460" w:type="dxa"/>
+            <w:vAlign w:val="center"/>
+            <w:shd w:fill="F0F5F8"/>
+          </w:tcPr>
+          <w:p>
+            <w:pPr>
+              <w:spacing w:after="0" w:line="270" w:lineRule="exact"/>
+            </w:pPr>
+            <w:r>
+              <w:rPr>
+                <w:rFonts w:ascii="Arial" w:hAnsi="Arial" w:eastAsia="Hiragino Sans GB"/>
+                <w:sz w:val="21"/>
+                <w:color w:val="000000"/>
+              </w:rPr>
+              <w:t>SGLang：BF16/FP32 常驻，Ulysses4，encoder auto</w:t>
+            </w:r>
+          </w:p>
+        </w:tc>
+        <w:tc>
+          <w:tcPr>
+            <w:tcW w:w="3100" w:type="dxa"/>
+            <w:vAlign w:val="center"/>
+            <w:shd w:fill="F0F5F8"/>
+          </w:tcPr>
+          <w:p>
+            <w:pPr>
+              <w:spacing w:after="0" w:line="270" w:lineRule="exact"/>
+            </w:pPr>
+            <w:r>
+              <w:rPr>
+                <w:rFonts w:ascii="Arial" w:hAnsi="Arial" w:eastAsia="Hiragino Sans GB"/>
+                <w:sz w:val="21"/>
+                <w:color w:val="000000"/>
+              </w:rPr>
+              <w:t>容量和预算更充裕时，优先考虑较少权重搬运的常驻方案</w:t>
+            </w:r>
+          </w:p>
+        </w:tc>
+      </w:tr>
+    </w:tbl>
+    <w:p>
+      <w:pPr>
+        <w:snapToGrid w:val="0"/>
+      </w:pPr>
+      <w:r>
+        <w:t>上述单卡、双卡容量示例来自 Diffusers 的 T2VA 工作流；四卡标准命令来自 SGLang 的 FL2VA 分区。A100 是按80GB容量路线列出的型号候选，执行时选择 Ampere 兼容 attention；Hopper 专用 FlashAttention3 参数对应 H100/H200。显卡型号与容量配方需要一起对应。[3、11、14]</w:t>
+      </w:r>
+    </w:p>
+    <w:p>
+      <w:pPr>
+        <w:pStyle w:val="Heading2"/>
+        <w:snapToGrid w:val="0"/>
+      </w:pPr>
+      <w:r>
+        <w:t>为什么四张卡也要区分型号</w:t>
+      </w:r>
+    </w:p>
+    <w:p>
+      <w:pPr>
+        <w:snapToGrid w:val="0"/>
+      </w:pPr>
+      <w:r>
+        <w:t>H200 的141GB单卡空间能采用纯 Ulysses4 的上游常驻配方；H100 80GB 采用 TP2＋Ulysses2，把模型权重和序列工作量分别切分。两者都写“四卡”，放置方式却不同。TP/FSDP 的权重切分与 Ulysses 的序列并行也不是同一件事。</w:t>
+      </w:r>
+    </w:p>
+    <w:p>
+      <w:pPr>
+        <w:pStyle w:val="Heading2"/>
+        <w:snapToGrid w:val="0"/>
+      </w:pPr>
+      <w:r>
+        <w:t>主机内存、任务与采购顺序</w:t>
+      </w:r>
+    </w:p>
+    <w:p>
+      <w:pPr>
+        <w:snapToGrid w:val="0"/>
+      </w:pPr>
+      <w:r>
+        <w:t>单80GB卸载路线需要系统 RAM 承接暂存权重。以完整权重和本项目文件规模规划，可把256GiB主机内存、至少300GiB可用持久盘作为工程预留起点；多卡服务还要结合加载过程、并发和缓存增加余量。这是采购建议，显存表中的卡数与厂商容量则是上游方案及型号规格。</w:t>
+      </w:r>
+    </w:p>
+    <w:p>
+      <w:pPr>
+        <w:snapToGrid w:val="0"/>
+      </w:pPr>
+      <w:r>
+        <w:t>若优先构建原精度 GPU 服务，先看4×H100或4×H200；卡数和成本受限时，再考虑双80GB分组件或单80GB卸载。本项目目标是单图 Ref2VA，配置时选择对应权重分区，并按参考素材、768P画幅和目标时长安排激活及解码空间。</w:t>
+      </w:r>
+    </w:p>
+    <w:p>
+      <w:pPr>
+        <w:pStyle w:val="Heading1"/>
+        <w:pageBreakBefore/>
+        <w:snapToGrid w:val="0"/>
+      </w:pPr>
+      <w:r>
+        <w:t>GPU 选型二 消费级与 48GB 显卡</w:t>
+      </w:r>
+    </w:p>
+    <w:p>
+      <w:pPr>
+        <w:snapToGrid w:val="0"/>
+      </w:pPr>
+      <w:r>
+        <w:t>消费卡的选择要连同量化、主机 RAM 和 PCIe 传输一起看。相同显卡可以采用不同的驻留层数和卸载方式，实际资源需求跟所选配方变化。下面将显存档位与具体型号对应起来，便于判断已有卡或升级目标。[3、11、13、15]</w:t>
+      </w:r>
+    </w:p>
+    <w:tbl>
+      <w:tblPr>
+        <w:tblW w:w="10080" w:type="dxa"/>
+        <w:tblLayout w:type="fixed"/>
+        <w:tblBorders>
+          <w:top w:val="single" w:sz="4" w:color="D9D9D9"/>
+          <w:left w:val="single" w:sz="4" w:color="D9D9D9"/>
+          <w:bottom w:val="single" w:sz="4" w:color="D9D9D9"/>
+          <w:right w:val="single" w:sz="4" w:color="D9D9D9"/>
+          <w:insideH w:val="single" w:sz="4" w:color="D9D9D9"/>
+          <w:insideV w:val="single" w:sz="4" w:color="D9D9D9"/>
+        </w:tblBorders>
+        <w:tblCellMar>
+          <w:top w:w="100" w:type="dxa"/>
+          <w:bottom w:w="100" w:type="dxa"/>
+          <w:left w:w="100" w:type="dxa"/>
+          <w:right w:w="100" w:type="dxa"/>
+        </w:tblCellMar>
+      </w:tblPr>
+      <w:tblGrid>
+        <w:gridCol w:w="2380"/>
+        <w:gridCol w:w="4270"/>
+        <w:gridCol w:w="3430"/>
+      </w:tblGrid>
+      <w:tr>
+        <w:trPr>
+          <w:cantSplit/>
+          <w:tblHeader/>
+        </w:trPr>
+        <w:tc>
+          <w:tcPr>
+            <w:tcW w:w="2380" w:type="dxa"/>
+            <w:vAlign w:val="center"/>
+            <w:shd w:fill="18384B"/>
+          </w:tcPr>
+          <w:p>
+            <w:pPr>
+              <w:spacing w:after="0" w:line="270" w:lineRule="exact"/>
+            </w:pPr>
+            <w:r>
+              <w:rPr>
+                <w:rFonts w:ascii="Arial" w:hAnsi="Arial" w:eastAsia="Hiragino Sans GB"/>
+                <w:sz w:val="21"/>
+                <w:color w:val="FFFFFF"/>
+                <w:b/>
+              </w:rPr>
+              <w:t>GPU 配置</w:t>
+            </w:r>
+          </w:p>
+        </w:tc>
+        <w:tc>
+          <w:tcPr>
+            <w:tcW w:w="4270" w:type="dxa"/>
+            <w:vAlign w:val="center"/>
+            <w:shd w:fill="18384B"/>
+          </w:tcPr>
+          <w:p>
+            <w:pPr>
+              <w:spacing w:after="0" w:line="270" w:lineRule="exact"/>
+            </w:pPr>
+            <w:r>
+              <w:rPr>
+                <w:rFonts w:ascii="Arial" w:hAnsi="Arial" w:eastAsia="Hiragino Sans GB"/>
+                <w:sz w:val="21"/>
+                <w:color w:val="FFFFFF"/>
+                <w:b/>
+              </w:rPr>
+              <w:t>可采用的执行路线</w:t>
+            </w:r>
+          </w:p>
+        </w:tc>
+        <w:tc>
+          <w:tcPr>
+            <w:tcW w:w="3430" w:type="dxa"/>
+            <w:vAlign w:val="center"/>
+            <w:shd w:fill="18384B"/>
+          </w:tcPr>
+          <w:p>
+            <w:pPr>
+              <w:spacing w:after="0" w:line="270" w:lineRule="exact"/>
+            </w:pPr>
+            <w:r>
+              <w:rPr>
+                <w:rFonts w:ascii="Arial" w:hAnsi="Arial" w:eastAsia="Hiragino Sans GB"/>
+                <w:sz w:val="21"/>
+                <w:color w:val="FFFFFF"/>
+                <w:b/>
+              </w:rPr>
+              <w:t>关键配套条件</w:t>
+            </w:r>
+          </w:p>
+        </w:tc>
+      </w:tr>
+      <w:tr>
+        <w:trPr>
+          <w:cantSplit/>
+        </w:trPr>
+        <w:tc>
+          <w:tcPr>
+            <w:tcW w:w="2380" w:type="dxa"/>
+            <w:vAlign w:val="center"/>
+            <w:shd w:fill="FFFFFF"/>
+          </w:tcPr>
+          <w:p>
+            <w:pPr>
+              <w:spacing w:after="0" w:line="270" w:lineRule="exact"/>
+            </w:pPr>
+            <w:r>
+              <w:rPr>
+                <w:rFonts w:ascii="Arial" w:hAnsi="Arial" w:eastAsia="Hiragino Sans GB"/>
+                <w:sz w:val="21"/>
+                <w:color w:val="000000"/>
+              </w:rPr>
+              <w:t>1×RTX 5060 Ti 16GB</w:t>
+            </w:r>
+          </w:p>
+        </w:tc>
+        <w:tc>
+          <w:tcPr>
+            <w:tcW w:w="4270" w:type="dxa"/>
+            <w:vAlign w:val="center"/>
+            <w:shd w:fill="FFFFFF"/>
+          </w:tcPr>
+          <w:p>
+            <w:pPr>
+              <w:spacing w:after="0" w:line="270" w:lineRule="exact"/>
+            </w:pPr>
+            <w:r>
+              <w:rPr>
+                <w:rFonts w:ascii="Arial" w:hAnsi="Arial" w:eastAsia="Hiragino Sans GB"/>
+                <w:sz w:val="21"/>
+                <w:color w:val="000000"/>
+              </w:rPr>
+              <w:t>Diffusers 的12–16GB档：INT8＋分组卸载，视频 VAE 也逐层卸载</w:t>
+            </w:r>
+          </w:p>
+        </w:tc>
+        <w:tc>
+          <w:tcPr>
+            <w:tcW w:w="3430" w:type="dxa"/>
+            <w:vAlign w:val="center"/>
+            <w:shd w:fill="FFFFFF"/>
+          </w:tcPr>
+          <w:p>
+            <w:pPr>
+              <w:spacing w:after="0" w:line="270" w:lineRule="exact"/>
+            </w:pPr>
+            <w:r>
+              <w:rPr>
+                <w:rFonts w:ascii="Arial" w:hAnsi="Arial" w:eastAsia="Hiragino Sans GB"/>
+                <w:sz w:val="21"/>
+                <w:color w:val="000000"/>
+              </w:rPr>
+              <w:t>示例为 T2VA、960×544；约75GB主机 RAM 用于INT8权重，另留运行余量</w:t>
+            </w:r>
+          </w:p>
+        </w:tc>
+      </w:tr>
+      <w:tr>
+        <w:trPr>
+          <w:cantSplit/>
+        </w:trPr>
+        <w:tc>
+          <w:tcPr>
+            <w:tcW w:w="2380" w:type="dxa"/>
+            <w:vAlign w:val="center"/>
+            <w:shd w:fill="F0F5F8"/>
+          </w:tcPr>
+          <w:p>
+            <w:pPr>
+              <w:spacing w:after="0" w:line="270" w:lineRule="exact"/>
+            </w:pPr>
+            <w:r>
+              <w:rPr>
+                <w:rFonts w:ascii="Arial" w:hAnsi="Arial" w:eastAsia="Hiragino Sans GB"/>
+                <w:sz w:val="21"/>
+                <w:color w:val="000000"/>
+              </w:rPr>
+              <w:t>1×RTX 4090 24GB</w:t>
+            </w:r>
+          </w:p>
+        </w:tc>
+        <w:tc>
+          <w:tcPr>
+            <w:tcW w:w="4270" w:type="dxa"/>
+            <w:vAlign w:val="center"/>
+            <w:shd w:fill="F0F5F8"/>
+          </w:tcPr>
+          <w:p>
+            <w:pPr>
+              <w:spacing w:after="0" w:line="270" w:lineRule="exact"/>
+            </w:pPr>
+            <w:r>
+              <w:rPr>
+                <w:rFonts w:ascii="Arial" w:hAnsi="Arial" w:eastAsia="Hiragino Sans GB"/>
+                <w:sz w:val="21"/>
+                <w:color w:val="000000"/>
+              </w:rPr>
+              <w:t>SGLang：ConvRot INT8＋逐层卸载；DiT/text encoder流式加载，视频 VAE 保持独立放置</w:t>
+            </w:r>
+          </w:p>
+        </w:tc>
+        <w:tc>
+          <w:tcPr>
+            <w:tcW w:w="3430" w:type="dxa"/>
+            <w:vAlign w:val="center"/>
+            <w:shd w:fill="F0F5F8"/>
+          </w:tcPr>
+          <w:p>
+            <w:pPr>
+              <w:spacing w:after="0" w:line="270" w:lineRule="exact"/>
+            </w:pPr>
+            <w:r>
+              <w:rPr>
+                <w:rFonts w:ascii="Arial" w:hAnsi="Arial" w:eastAsia="Hiragino Sans GB"/>
+                <w:sz w:val="21"/>
+                <w:color w:val="000000"/>
+              </w:rPr>
+              <w:t>Ada 使用匹配内核；该上游配方使用 comfy-kitchen，主机内存与PCIe也影响速度</w:t>
+            </w:r>
+          </w:p>
+        </w:tc>
+      </w:tr>
+      <w:tr>
+        <w:trPr>
+          <w:cantSplit/>
+        </w:trPr>
+        <w:tc>
+          <w:tcPr>
+            <w:tcW w:w="2380" w:type="dxa"/>
+            <w:vAlign w:val="center"/>
+            <w:shd w:fill="FFFFFF"/>
+          </w:tcPr>
+          <w:p>
+            <w:pPr>
+              <w:spacing w:after="0" w:line="270" w:lineRule="exact"/>
+            </w:pPr>
+            <w:r>
+              <w:rPr>
+                <w:rFonts w:ascii="Arial" w:hAnsi="Arial" w:eastAsia="Hiragino Sans GB"/>
+                <w:sz w:val="21"/>
+                <w:color w:val="000000"/>
+              </w:rPr>
+              <w:t>1×RTX 5090 32GB</w:t>
+            </w:r>
+          </w:p>
+        </w:tc>
+        <w:tc>
+          <w:tcPr>
+            <w:tcW w:w="4270" w:type="dxa"/>
+            <w:vAlign w:val="center"/>
+            <w:shd w:fill="FFFFFF"/>
+          </w:tcPr>
+          <w:p>
+            <w:pPr>
+              <w:spacing w:after="0" w:line="270" w:lineRule="exact"/>
+            </w:pPr>
+            <w:r>
+              <w:rPr>
+                <w:rFonts w:ascii="Arial" w:hAnsi="Arial" w:eastAsia="Hiragino Sans GB"/>
+                <w:sz w:val="21"/>
+                <w:color w:val="000000"/>
+              </w:rPr>
+              <w:t>SGLang：原精度 BF16 逐层卸载；可调整DiT与视频VAE驻留层数</w:t>
+            </w:r>
+          </w:p>
+        </w:tc>
+        <w:tc>
+          <w:tcPr>
+            <w:tcW w:w="3430" w:type="dxa"/>
+            <w:vAlign w:val="center"/>
+            <w:shd w:fill="FFFFFF"/>
+          </w:tcPr>
+          <w:p>
+            <w:pPr>
+              <w:spacing w:after="0" w:line="270" w:lineRule="exact"/>
+            </w:pPr>
+            <w:r>
+              <w:rPr>
+                <w:rFonts w:ascii="Arial" w:hAnsi="Arial" w:eastAsia="Hiragino Sans GB"/>
+                <w:sz w:val="21"/>
+                <w:color w:val="000000"/>
+              </w:rPr>
+              <w:t>上游物理桌面例配快速PCIe5 NVMe；其480P、20步设置单独看待</w:t>
+            </w:r>
+          </w:p>
+        </w:tc>
+      </w:tr>
+      <w:tr>
+        <w:trPr>
+          <w:cantSplit/>
+        </w:trPr>
+        <w:tc>
+          <w:tcPr>
+            <w:tcW w:w="2380" w:type="dxa"/>
+            <w:vAlign w:val="center"/>
+            <w:shd w:fill="F0F5F8"/>
+          </w:tcPr>
+          <w:p>
+            <w:pPr>
+              <w:spacing w:after="0" w:line="270" w:lineRule="exact"/>
+            </w:pPr>
+            <w:r>
+              <w:rPr>
+                <w:rFonts w:ascii="Arial" w:hAnsi="Arial" w:eastAsia="Hiragino Sans GB"/>
+                <w:sz w:val="21"/>
+                <w:color w:val="000000"/>
+              </w:rPr>
+              <w:t>2×RTX 5090 32GB</w:t>
+            </w:r>
+          </w:p>
+        </w:tc>
+        <w:tc>
+          <w:tcPr>
+            <w:tcW w:w="4270" w:type="dxa"/>
+            <w:vAlign w:val="center"/>
+            <w:shd w:fill="F0F5F8"/>
+          </w:tcPr>
+          <w:p>
+            <w:pPr>
+              <w:spacing w:after="0" w:line="270" w:lineRule="exact"/>
+            </w:pPr>
+            <w:r>
+              <w:rPr>
+                <w:rFonts w:ascii="Arial" w:hAnsi="Arial" w:eastAsia="Hiragino Sans GB"/>
+                <w:sz w:val="21"/>
+                <w:color w:val="000000"/>
+              </w:rPr>
+              <w:t>SGLang：原精度 BF16/FP32，TP2＋逐层卸载，DiT驻留20层</w:t>
+            </w:r>
+          </w:p>
+        </w:tc>
+        <w:tc>
+          <w:tcPr>
+            <w:tcW w:w="3430" w:type="dxa"/>
+            <w:vAlign w:val="center"/>
+            <w:shd w:fill="F0F5F8"/>
+          </w:tcPr>
+          <w:p>
+            <w:pPr>
+              <w:spacing w:after="0" w:line="270" w:lineRule="exact"/>
+            </w:pPr>
+            <w:r>
+              <w:rPr>
+                <w:rFonts w:ascii="Arial" w:hAnsi="Arial" w:eastAsia="Hiragino Sans GB"/>
+                <w:sz w:val="21"/>
+                <w:color w:val="000000"/>
+              </w:rPr>
+              <w:t>原配方使用377GiB主机，文档建议384GiB级内存；核对PCIe与P2P</w:t>
+            </w:r>
+          </w:p>
+        </w:tc>
+      </w:tr>
+      <w:tr>
+        <w:trPr>
+          <w:cantSplit/>
+        </w:trPr>
+        <w:tc>
+          <w:tcPr>
+            <w:tcW w:w="2380" w:type="dxa"/>
+            <w:vAlign w:val="center"/>
+            <w:shd w:fill="FFFFFF"/>
+          </w:tcPr>
+          <w:p>
+            <w:pPr>
+              <w:spacing w:after="0" w:line="270" w:lineRule="exact"/>
+            </w:pPr>
+            <w:r>
+              <w:rPr>
+                <w:rFonts w:ascii="Arial" w:hAnsi="Arial" w:eastAsia="Hiragino Sans GB"/>
+                <w:sz w:val="21"/>
+                <w:color w:val="000000"/>
+              </w:rPr>
+              <w:t>2×48GB卡
+如 L40S 48GB</w:t>
+            </w:r>
+          </w:p>
+        </w:tc>
+        <w:tc>
+          <w:tcPr>
+            <w:tcW w:w="4270" w:type="dxa"/>
+            <w:vAlign w:val="center"/>
+            <w:shd w:fill="FFFFFF"/>
+          </w:tcPr>
+          <w:p>
+            <w:pPr>
+              <w:spacing w:after="0" w:line="270" w:lineRule="exact"/>
+            </w:pPr>
+            <w:r>
+              <w:rPr>
+                <w:rFonts w:ascii="Arial" w:hAnsi="Arial" w:eastAsia="Hiragino Sans GB"/>
+                <w:sz w:val="21"/>
+                <w:color w:val="000000"/>
+              </w:rPr>
+              <w:t>Diffusers：Transformer和Qwen做INT8，按组件分到两卡</w:t>
+            </w:r>
+          </w:p>
+        </w:tc>
+        <w:tc>
+          <w:tcPr>
+            <w:tcW w:w="3430" w:type="dxa"/>
+            <w:vAlign w:val="center"/>
+            <w:shd w:fill="FFFFFF"/>
+          </w:tcPr>
+          <w:p>
+            <w:pPr>
+              <w:spacing w:after="0" w:line="270" w:lineRule="exact"/>
+            </w:pPr>
+            <w:r>
+              <w:rPr>
+                <w:rFonts w:ascii="Arial" w:hAnsi="Arial" w:eastAsia="Hiragino Sans GB"/>
+                <w:sz w:val="21"/>
+                <w:color w:val="000000"/>
+              </w:rPr>
+              <w:t>来源为T2VA容量示例；L40S属于48GB型号候选，使用Ada兼容后端</w:t>
+            </w:r>
+          </w:p>
+        </w:tc>
+      </w:tr>
+    </w:tbl>
+    <w:p>
+      <w:pPr>
+        <w:snapToGrid w:val="0"/>
+      </w:pPr>
+      <w:r>
+        <w:t>这里的约75GB指 INT8 权重主要放在主机 RAM 中的量级，不是显存需求。在线量化、加载瞬态、激活和系统占用还需要空间；采购时可按128–256GB主机内存规划，再与选定的加载方式匹配。双5090的384GiB级要求属于另一份追求性能的原精度配方。</w:t>
+      </w:r>
+    </w:p>
+    <w:p>
+      <w:pPr>
+        <w:pStyle w:val="Heading2"/>
+        <w:snapToGrid w:val="0"/>
+      </w:pPr>
+      <w:r>
+        <w:t>为什么单5090与双5090的主机配置差很多</w:t>
+      </w:r>
+    </w:p>
+    <w:p>
+      <w:pPr>
+        <w:snapToGrid w:val="0"/>
+      </w:pPr>
+      <w:r>
+        <w:t>单卡物理桌面示例使用60GB RAM、8GB swap和高速NVMe，以分层读取降低驻留量；双卡配方则用更多主机内存承载原始权重并安排预取。较小RAM容量会增加磁盘读取与交换开销，不能按显卡数量给主机 RAM 简单乘二。上述桌面规格是对应方案的运行条件，不是通用采购下限。</w:t>
+      </w:r>
+    </w:p>
+    <w:p>
+      <w:pPr>
+        <w:snapToGrid w:val="0"/>
+      </w:pPr>
+      <w:r>
+        <w:t>对我的16GB 5060 Ti，完整精度大组件常驻路线在容量上不成立；低显存量化路线则需要改变精度、组件调度和画布。若希望升级消费卡，先比较24GB、32GB及48GB档位能采用的配方，再把主机内存、存储和总成本一起列入预算。</w:t>
+      </w:r>
+    </w:p>
+    <w:p>
+      <w:pPr>
+        <w:pStyle w:val="Heading1"/>
+        <w:pageBreakBefore/>
+        <w:snapToGrid w:val="0"/>
+      </w:pPr>
+      <w:r>
+        <w:t>GPU 选型三 同容量显卡怎么比较</w:t>
+      </w:r>
+    </w:p>
+    <w:p>
+      <w:pPr>
+        <w:snapToGrid w:val="0"/>
+      </w:pPr>
+      <w:r>
+        <w:t>下表的GB沿用厂家显存标注，带宽是显存带宽；NVLink或PCIe是GPU之间及与主机之间的连接，二者不能相加。型号、封装和架构会影响显存吞吐、原生精度以及可选 attention 内核。[13、14、15、16]</w:t>
+      </w:r>
+    </w:p>
+    <w:tbl>
+      <w:tblPr>
+        <w:tblW w:w="10080" w:type="dxa"/>
+        <w:tblLayout w:type="fixed"/>
+        <w:tblBorders>
+          <w:top w:val="single" w:sz="4" w:color="D9D9D9"/>
+          <w:left w:val="single" w:sz="4" w:color="D9D9D9"/>
+          <w:bottom w:val="single" w:sz="4" w:color="D9D9D9"/>
+          <w:right w:val="single" w:sz="4" w:color="D9D9D9"/>
+          <w:insideH w:val="single" w:sz="4" w:color="D9D9D9"/>
+          <w:insideV w:val="single" w:sz="4" w:color="D9D9D9"/>
+        </w:tblBorders>
+        <w:tblCellMar>
+          <w:top w:w="100" w:type="dxa"/>
+          <w:bottom w:w="100" w:type="dxa"/>
+          <w:left w:w="100" w:type="dxa"/>
+          <w:right w:w="100" w:type="dxa"/>
+        </w:tblCellMar>
+      </w:tblPr>
+      <w:tblGrid>
+        <w:gridCol w:w="2590"/>
+        <w:gridCol w:w="3550"/>
+        <w:gridCol w:w="3940"/>
+      </w:tblGrid>
+      <w:tr>
+        <w:trPr>
+          <w:cantSplit/>
+          <w:tblHeader/>
+        </w:trPr>
+        <w:tc>
+          <w:tcPr>
+            <w:tcW w:w="2590" w:type="dxa"/>
+            <w:vAlign w:val="center"/>
+            <w:shd w:fill="18384B"/>
+          </w:tcPr>
+          <w:p>
+            <w:pPr>
+              <w:spacing w:after="0" w:line="270" w:lineRule="exact"/>
+            </w:pPr>
+            <w:r>
+              <w:rPr>
+                <w:rFonts w:ascii="Arial" w:hAnsi="Arial" w:eastAsia="Hiragino Sans GB"/>
+                <w:sz w:val="21"/>
+                <w:color w:val="FFFFFF"/>
+                <w:b/>
+              </w:rPr>
+              <w:t>型号与显存</w:t>
+            </w:r>
+          </w:p>
+        </w:tc>
+        <w:tc>
+          <w:tcPr>
+            <w:tcW w:w="3550" w:type="dxa"/>
+            <w:vAlign w:val="center"/>
+            <w:shd w:fill="18384B"/>
+          </w:tcPr>
+          <w:p>
+            <w:pPr>
+              <w:spacing w:after="0" w:line="270" w:lineRule="exact"/>
+            </w:pPr>
+            <w:r>
+              <w:rPr>
+                <w:rFonts w:ascii="Arial" w:hAnsi="Arial" w:eastAsia="Hiragino Sans GB"/>
+                <w:sz w:val="21"/>
+                <w:color w:val="FFFFFF"/>
+                <w:b/>
+              </w:rPr>
+              <w:t>架构与显存带宽</w:t>
+            </w:r>
+          </w:p>
+        </w:tc>
+        <w:tc>
+          <w:tcPr>
+            <w:tcW w:w="3940" w:type="dxa"/>
+            <w:vAlign w:val="center"/>
+            <w:shd w:fill="18384B"/>
+          </w:tcPr>
+          <w:p>
+            <w:pPr>
+              <w:spacing w:after="0" w:line="270" w:lineRule="exact"/>
+            </w:pPr>
+            <w:r>
+              <w:rPr>
+                <w:rFonts w:ascii="Arial" w:hAnsi="Arial" w:eastAsia="Hiragino Sans GB"/>
+                <w:sz w:val="21"/>
+                <w:color w:val="FFFFFF"/>
+                <w:b/>
+              </w:rPr>
+              <w:t>选型时的区别</w:t>
+            </w:r>
+          </w:p>
+        </w:tc>
+      </w:tr>
+      <w:tr>
+        <w:trPr>
+          <w:cantSplit/>
+        </w:trPr>
+        <w:tc>
+          <w:tcPr>
+            <w:tcW w:w="2590" w:type="dxa"/>
+            <w:vAlign w:val="center"/>
+            <w:shd w:fill="FFFFFF"/>
+          </w:tcPr>
+          <w:p>
+            <w:pPr>
+              <w:spacing w:after="0" w:line="270" w:lineRule="exact"/>
+            </w:pPr>
+            <w:r>
+              <w:rPr>
+                <w:rFonts w:ascii="Arial" w:hAnsi="Arial" w:eastAsia="Hiragino Sans GB"/>
+                <w:sz w:val="21"/>
+                <w:color w:val="000000"/>
+              </w:rPr>
+              <w:t>H200 141GB</w:t>
+            </w:r>
+          </w:p>
+        </w:tc>
+        <w:tc>
+          <w:tcPr>
+            <w:tcW w:w="3550" w:type="dxa"/>
+            <w:vAlign w:val="center"/>
+            <w:shd w:fill="FFFFFF"/>
+          </w:tcPr>
+          <w:p>
+            <w:pPr>
+              <w:spacing w:after="0" w:line="270" w:lineRule="exact"/>
+            </w:pPr>
+            <w:r>
+              <w:rPr>
+                <w:rFonts w:ascii="Arial" w:hAnsi="Arial" w:eastAsia="Hiragino Sans GB"/>
+                <w:sz w:val="21"/>
+                <w:color w:val="000000"/>
+              </w:rPr>
+              <w:t>Hopper；约4.8TB/s</w:t>
+            </w:r>
+          </w:p>
+        </w:tc>
+        <w:tc>
+          <w:tcPr>
+            <w:tcW w:w="3940" w:type="dxa"/>
+            <w:vAlign w:val="center"/>
+            <w:shd w:fill="FFFFFF"/>
+          </w:tcPr>
+          <w:p>
+            <w:pPr>
+              <w:spacing w:after="0" w:line="270" w:lineRule="exact"/>
+            </w:pPr>
+            <w:r>
+              <w:rPr>
+                <w:rFonts w:ascii="Arial" w:hAnsi="Arial" w:eastAsia="Hiragino Sans GB"/>
+                <w:sz w:val="21"/>
+                <w:color w:val="000000"/>
+              </w:rPr>
+              <w:t>大显存与高速互联，适合上游常驻多卡方案</w:t>
+            </w:r>
+          </w:p>
+        </w:tc>
+      </w:tr>
+      <w:tr>
+        <w:trPr>
+          <w:cantSplit/>
+        </w:trPr>
+        <w:tc>
+          <w:tcPr>
+            <w:tcW w:w="2590" w:type="dxa"/>
+            <w:vAlign w:val="center"/>
+            <w:shd w:fill="F0F5F8"/>
+          </w:tcPr>
+          <w:p>
+            <w:pPr>
+              <w:spacing w:after="0" w:line="270" w:lineRule="exact"/>
+            </w:pPr>
+            <w:r>
+              <w:rPr>
+                <w:rFonts w:ascii="Arial" w:hAnsi="Arial" w:eastAsia="Hiragino Sans GB"/>
+                <w:sz w:val="21"/>
+                <w:color w:val="000000"/>
+              </w:rPr>
+              <w:t>H100 80GB</w:t>
+            </w:r>
+          </w:p>
+        </w:tc>
+        <w:tc>
+          <w:tcPr>
+            <w:tcW w:w="3550" w:type="dxa"/>
+            <w:vAlign w:val="center"/>
+            <w:shd w:fill="F0F5F8"/>
+          </w:tcPr>
+          <w:p>
+            <w:pPr>
+              <w:spacing w:after="0" w:line="270" w:lineRule="exact"/>
+            </w:pPr>
+            <w:r>
+              <w:rPr>
+                <w:rFonts w:ascii="Arial" w:hAnsi="Arial" w:eastAsia="Hiragino Sans GB"/>
+                <w:sz w:val="21"/>
+                <w:color w:val="000000"/>
+              </w:rPr>
+              <w:t>Hopper；SXM约3.35TB/s，PCIe约2.0TB/s</w:t>
+            </w:r>
+          </w:p>
+        </w:tc>
+        <w:tc>
+          <w:tcPr>
+            <w:tcW w:w="3940" w:type="dxa"/>
+            <w:vAlign w:val="center"/>
+            <w:shd w:fill="F0F5F8"/>
+          </w:tcPr>
+          <w:p>
+            <w:pPr>
+              <w:spacing w:after="0" w:line="270" w:lineRule="exact"/>
+            </w:pPr>
+            <w:r>
+              <w:rPr>
+                <w:rFonts w:ascii="Arial" w:hAnsi="Arial" w:eastAsia="Hiragino Sans GB"/>
+                <w:sz w:val="21"/>
+                <w:color w:val="000000"/>
+              </w:rPr>
+              <w:t>写清SXM/PCIe与整机拓扑，不能只写H100</w:t>
+            </w:r>
+          </w:p>
+        </w:tc>
+      </w:tr>
+      <w:tr>
+        <w:trPr>
+          <w:cantSplit/>
+        </w:trPr>
+        <w:tc>
+          <w:tcPr>
+            <w:tcW w:w="2590" w:type="dxa"/>
+            <w:vAlign w:val="center"/>
+            <w:shd w:fill="FFFFFF"/>
+          </w:tcPr>
+          <w:p>
+            <w:pPr>
+              <w:spacing w:after="0" w:line="270" w:lineRule="exact"/>
+            </w:pPr>
+            <w:r>
+              <w:rPr>
+                <w:rFonts w:ascii="Arial" w:hAnsi="Arial" w:eastAsia="Hiragino Sans GB"/>
+                <w:sz w:val="21"/>
+                <w:color w:val="000000"/>
+              </w:rPr>
+              <w:t>A100 80GB</w:t>
+            </w:r>
+          </w:p>
+        </w:tc>
+        <w:tc>
+          <w:tcPr>
+            <w:tcW w:w="3550" w:type="dxa"/>
+            <w:vAlign w:val="center"/>
+            <w:shd w:fill="FFFFFF"/>
+          </w:tcPr>
+          <w:p>
+            <w:pPr>
+              <w:spacing w:after="0" w:line="270" w:lineRule="exact"/>
+            </w:pPr>
+            <w:r>
+              <w:rPr>
+                <w:rFonts w:ascii="Arial" w:hAnsi="Arial" w:eastAsia="Hiragino Sans GB"/>
+                <w:sz w:val="21"/>
+                <w:color w:val="000000"/>
+              </w:rPr>
+              <w:t>Ampere；PCIe约1.935TB/s，SXM约2.039TB/s</w:t>
+            </w:r>
+          </w:p>
+        </w:tc>
+        <w:tc>
+          <w:tcPr>
+            <w:tcW w:w="3940" w:type="dxa"/>
+            <w:vAlign w:val="center"/>
+            <w:shd w:fill="FFFFFF"/>
+          </w:tcPr>
+          <w:p>
+            <w:pPr>
+              <w:spacing w:after="0" w:line="270" w:lineRule="exact"/>
+            </w:pPr>
+            <w:r>
+              <w:rPr>
+                <w:rFonts w:ascii="Arial" w:hAnsi="Arial" w:eastAsia="Hiragino Sans GB"/>
+                <w:sz w:val="21"/>
+                <w:color w:val="000000"/>
+              </w:rPr>
+              <w:t>区分40GB/80GB版本；80GB容量相同也不等于H100</w:t>
+            </w:r>
+          </w:p>
+        </w:tc>
+      </w:tr>
+      <w:tr>
+        <w:trPr>
+          <w:cantSplit/>
+        </w:trPr>
+        <w:tc>
+          <w:tcPr>
+            <w:tcW w:w="2590" w:type="dxa"/>
+            <w:vAlign w:val="center"/>
+            <w:shd w:fill="F0F5F8"/>
+          </w:tcPr>
+          <w:p>
+            <w:pPr>
+              <w:spacing w:after="0" w:line="270" w:lineRule="exact"/>
+            </w:pPr>
+            <w:r>
+              <w:rPr>
+                <w:rFonts w:ascii="Arial" w:hAnsi="Arial" w:eastAsia="Hiragino Sans GB"/>
+                <w:sz w:val="21"/>
+                <w:color w:val="000000"/>
+              </w:rPr>
+              <w:t>L40S 48GB</w:t>
+            </w:r>
+          </w:p>
+        </w:tc>
+        <w:tc>
+          <w:tcPr>
+            <w:tcW w:w="3550" w:type="dxa"/>
+            <w:vAlign w:val="center"/>
+            <w:shd w:fill="F0F5F8"/>
+          </w:tcPr>
+          <w:p>
+            <w:pPr>
+              <w:spacing w:after="0" w:line="270" w:lineRule="exact"/>
+            </w:pPr>
+            <w:r>
+              <w:rPr>
+                <w:rFonts w:ascii="Arial" w:hAnsi="Arial" w:eastAsia="Hiragino Sans GB"/>
+                <w:sz w:val="21"/>
+                <w:color w:val="000000"/>
+              </w:rPr>
+              <w:t>Ada；约864GB/s</w:t>
+            </w:r>
+          </w:p>
+        </w:tc>
+        <w:tc>
+          <w:tcPr>
+            <w:tcW w:w="3940" w:type="dxa"/>
+            <w:vAlign w:val="center"/>
+            <w:shd w:fill="F0F5F8"/>
+          </w:tcPr>
+          <w:p>
+            <w:pPr>
+              <w:spacing w:after="0" w:line="270" w:lineRule="exact"/>
+            </w:pPr>
+            <w:r>
+              <w:rPr>
+                <w:rFonts w:ascii="Arial" w:hAnsi="Arial" w:eastAsia="Hiragino Sans GB"/>
+                <w:sz w:val="21"/>
+                <w:color w:val="000000"/>
+              </w:rPr>
+              <w:t>48GB可用于量化分组件方案；无NVLink</w:t>
+            </w:r>
+          </w:p>
+        </w:tc>
+      </w:tr>
+      <w:tr>
+        <w:trPr>
+          <w:cantSplit/>
+        </w:trPr>
+        <w:tc>
+          <w:tcPr>
+            <w:tcW w:w="2590" w:type="dxa"/>
+            <w:vAlign w:val="center"/>
+            <w:shd w:fill="FFFFFF"/>
+          </w:tcPr>
+          <w:p>
+            <w:pPr>
+              <w:spacing w:after="0" w:line="270" w:lineRule="exact"/>
+            </w:pPr>
+            <w:r>
+              <w:rPr>
+                <w:rFonts w:ascii="Arial" w:hAnsi="Arial" w:eastAsia="Hiragino Sans GB"/>
+                <w:sz w:val="21"/>
+                <w:color w:val="000000"/>
+              </w:rPr>
+              <w:t>RTX 5090 32GB</w:t>
+            </w:r>
+          </w:p>
+        </w:tc>
+        <w:tc>
+          <w:tcPr>
+            <w:tcW w:w="3550" w:type="dxa"/>
+            <w:vAlign w:val="center"/>
+            <w:shd w:fill="FFFFFF"/>
+          </w:tcPr>
+          <w:p>
+            <w:pPr>
+              <w:spacing w:after="0" w:line="270" w:lineRule="exact"/>
+            </w:pPr>
+            <w:r>
+              <w:rPr>
+                <w:rFonts w:ascii="Arial" w:hAnsi="Arial" w:eastAsia="Hiragino Sans GB"/>
+                <w:sz w:val="21"/>
+                <w:color w:val="000000"/>
+              </w:rPr>
+              <w:t>Blackwell；约1792GB/s</w:t>
+            </w:r>
+          </w:p>
+        </w:tc>
+        <w:tc>
+          <w:tcPr>
+            <w:tcW w:w="3940" w:type="dxa"/>
+            <w:vAlign w:val="center"/>
+            <w:shd w:fill="FFFFFF"/>
+          </w:tcPr>
+          <w:p>
+            <w:pPr>
+              <w:spacing w:after="0" w:line="270" w:lineRule="exact"/>
+            </w:pPr>
+            <w:r>
+              <w:rPr>
+                <w:rFonts w:ascii="Arial" w:hAnsi="Arial" w:eastAsia="Hiragino Sans GB"/>
+                <w:sz w:val="21"/>
+                <w:color w:val="000000"/>
+              </w:rPr>
+              <w:t>原生BF16；该型号无NVLink，关注PCIe和卸载策略</w:t>
+            </w:r>
+          </w:p>
+        </w:tc>
+      </w:tr>
+      <w:tr>
+        <w:trPr>
+          <w:cantSplit/>
+        </w:trPr>
+        <w:tc>
+          <w:tcPr>
+            <w:tcW w:w="2590" w:type="dxa"/>
+            <w:vAlign w:val="center"/>
+            <w:shd w:fill="F0F5F8"/>
+          </w:tcPr>
+          <w:p>
+            <w:pPr>
+              <w:spacing w:after="0" w:line="270" w:lineRule="exact"/>
+            </w:pPr>
+            <w:r>
+              <w:rPr>
+                <w:rFonts w:ascii="Arial" w:hAnsi="Arial" w:eastAsia="Hiragino Sans GB"/>
+                <w:sz w:val="21"/>
+                <w:color w:val="000000"/>
+              </w:rPr>
+              <w:t>RTX 4090 24GB</w:t>
+            </w:r>
+          </w:p>
+        </w:tc>
+        <w:tc>
+          <w:tcPr>
+            <w:tcW w:w="3550" w:type="dxa"/>
+            <w:vAlign w:val="center"/>
+            <w:shd w:fill="F0F5F8"/>
+          </w:tcPr>
+          <w:p>
+            <w:pPr>
+              <w:spacing w:after="0" w:line="270" w:lineRule="exact"/>
+            </w:pPr>
+            <w:r>
+              <w:rPr>
+                <w:rFonts w:ascii="Arial" w:hAnsi="Arial" w:eastAsia="Hiragino Sans GB"/>
+                <w:sz w:val="21"/>
+                <w:color w:val="000000"/>
+              </w:rPr>
+              <w:t>Ada；约1008GB/s</w:t>
+            </w:r>
+          </w:p>
+        </w:tc>
+        <w:tc>
+          <w:tcPr>
+            <w:tcW w:w="3940" w:type="dxa"/>
+            <w:vAlign w:val="center"/>
+            <w:shd w:fill="F0F5F8"/>
+          </w:tcPr>
+          <w:p>
+            <w:pPr>
+              <w:spacing w:after="0" w:line="270" w:lineRule="exact"/>
+            </w:pPr>
+            <w:r>
+              <w:rPr>
+                <w:rFonts w:ascii="Arial" w:hAnsi="Arial" w:eastAsia="Hiragino Sans GB"/>
+                <w:sz w:val="21"/>
+                <w:color w:val="000000"/>
+              </w:rPr>
+              <w:t>原生BF16；量化与attention内核按Ada选择</w:t>
+            </w:r>
+          </w:p>
+        </w:tc>
+      </w:tr>
+      <w:tr>
+        <w:trPr>
+          <w:cantSplit/>
+        </w:trPr>
+        <w:tc>
+          <w:tcPr>
+            <w:tcW w:w="2590" w:type="dxa"/>
+            <w:vAlign w:val="center"/>
+            <w:shd w:fill="FFFFFF"/>
+          </w:tcPr>
+          <w:p>
+            <w:pPr>
+              <w:spacing w:after="0" w:line="270" w:lineRule="exact"/>
+            </w:pPr>
+            <w:r>
+              <w:rPr>
+                <w:rFonts w:ascii="Arial" w:hAnsi="Arial" w:eastAsia="Hiragino Sans GB"/>
+                <w:sz w:val="21"/>
+                <w:color w:val="000000"/>
+              </w:rPr>
+              <w:t>RTX 5060 Ti 16GB</w:t>
+            </w:r>
+          </w:p>
+        </w:tc>
+        <w:tc>
+          <w:tcPr>
+            <w:tcW w:w="3550" w:type="dxa"/>
+            <w:vAlign w:val="center"/>
+            <w:shd w:fill="FFFFFF"/>
+          </w:tcPr>
+          <w:p>
+            <w:pPr>
+              <w:spacing w:after="0" w:line="270" w:lineRule="exact"/>
+            </w:pPr>
+            <w:r>
+              <w:rPr>
+                <w:rFonts w:ascii="Arial" w:hAnsi="Arial" w:eastAsia="Hiragino Sans GB"/>
+                <w:sz w:val="21"/>
+                <w:color w:val="000000"/>
+              </w:rPr>
+              <w:t>Blackwell；约448GB/s</w:t>
+            </w:r>
+          </w:p>
+        </w:tc>
+        <w:tc>
+          <w:tcPr>
+            <w:tcW w:w="3940" w:type="dxa"/>
+            <w:vAlign w:val="center"/>
+            <w:shd w:fill="FFFFFF"/>
+          </w:tcPr>
+          <w:p>
+            <w:pPr>
+              <w:spacing w:after="0" w:line="270" w:lineRule="exact"/>
+            </w:pPr>
+            <w:r>
+              <w:rPr>
+                <w:rFonts w:ascii="Arial" w:hAnsi="Arial" w:eastAsia="Hiragino Sans GB"/>
+                <w:sz w:val="21"/>
+                <w:color w:val="000000"/>
+              </w:rPr>
+              <w:t>原生BF16，但容量需配量化、卸载与小画布</w:t>
+            </w:r>
+          </w:p>
+        </w:tc>
+      </w:tr>
+      <w:tr>
+        <w:trPr>
+          <w:cantSplit/>
+        </w:trPr>
+        <w:tc>
+          <w:tcPr>
+            <w:tcW w:w="2590" w:type="dxa"/>
+            <w:vAlign w:val="center"/>
+            <w:shd w:fill="F0F5F8"/>
+          </w:tcPr>
+          <w:p>
+            <w:pPr>
+              <w:spacing w:after="0" w:line="270" w:lineRule="exact"/>
+            </w:pPr>
+            <w:r>
+              <w:rPr>
+                <w:rFonts w:ascii="Arial" w:hAnsi="Arial" w:eastAsia="Hiragino Sans GB"/>
+                <w:sz w:val="21"/>
+                <w:color w:val="000000"/>
+              </w:rPr>
+              <w:t>V100 16GB或32GB</w:t>
+            </w:r>
+          </w:p>
+        </w:tc>
+        <w:tc>
+          <w:tcPr>
+            <w:tcW w:w="3550" w:type="dxa"/>
+            <w:vAlign w:val="center"/>
+            <w:shd w:fill="F0F5F8"/>
+          </w:tcPr>
+          <w:p>
+            <w:pPr>
+              <w:spacing w:after="0" w:line="270" w:lineRule="exact"/>
+            </w:pPr>
+            <w:r>
+              <w:rPr>
+                <w:rFonts w:ascii="Arial" w:hAnsi="Arial" w:eastAsia="Hiragino Sans GB"/>
+                <w:sz w:val="21"/>
+                <w:color w:val="000000"/>
+              </w:rPr>
+              <w:t>Volta；约900GB/s</w:t>
+            </w:r>
+          </w:p>
+        </w:tc>
+        <w:tc>
+          <w:tcPr>
+            <w:tcW w:w="3940" w:type="dxa"/>
+            <w:vAlign w:val="center"/>
+            <w:shd w:fill="F0F5F8"/>
+          </w:tcPr>
+          <w:p>
+            <w:pPr>
+              <w:spacing w:after="0" w:line="270" w:lineRule="exact"/>
+            </w:pPr>
+            <w:r>
+              <w:rPr>
+                <w:rFonts w:ascii="Arial" w:hAnsi="Arial" w:eastAsia="Hiragino Sans GB"/>
+                <w:sz w:val="21"/>
+                <w:color w:val="000000"/>
+              </w:rPr>
+              <w:t>无原生BF16；SXM2与PCIe互联能力不同</w:t>
+            </w:r>
+          </w:p>
+        </w:tc>
+      </w:tr>
+      <w:tr>
+        <w:trPr>
+          <w:cantSplit/>
+        </w:trPr>
+        <w:tc>
+          <w:tcPr>
+            <w:tcW w:w="2590" w:type="dxa"/>
+            <w:vAlign w:val="center"/>
+            <w:shd w:fill="FFFFFF"/>
+          </w:tcPr>
+          <w:p>
+            <w:pPr>
+              <w:spacing w:after="0" w:line="270" w:lineRule="exact"/>
+            </w:pPr>
+            <w:r>
+              <w:rPr>
+                <w:rFonts w:ascii="Arial" w:hAnsi="Arial" w:eastAsia="Hiragino Sans GB"/>
+                <w:sz w:val="21"/>
+                <w:color w:val="000000"/>
+              </w:rPr>
+              <w:t>T4 16GB</w:t>
+            </w:r>
+          </w:p>
+        </w:tc>
+        <w:tc>
+          <w:tcPr>
+            <w:tcW w:w="3550" w:type="dxa"/>
+            <w:vAlign w:val="center"/>
+            <w:shd w:fill="FFFFFF"/>
+          </w:tcPr>
+          <w:p>
+            <w:pPr>
+              <w:spacing w:after="0" w:line="270" w:lineRule="exact"/>
+            </w:pPr>
+            <w:r>
+              <w:rPr>
+                <w:rFonts w:ascii="Arial" w:hAnsi="Arial" w:eastAsia="Hiragino Sans GB"/>
+                <w:sz w:val="21"/>
+                <w:color w:val="000000"/>
+              </w:rPr>
+              <w:t>Turing；约300GB/s</w:t>
+            </w:r>
+          </w:p>
+        </w:tc>
+        <w:tc>
+          <w:tcPr>
+            <w:tcW w:w="3940" w:type="dxa"/>
+            <w:vAlign w:val="center"/>
+            <w:shd w:fill="FFFFFF"/>
+          </w:tcPr>
+          <w:p>
+            <w:pPr>
+              <w:spacing w:after="0" w:line="270" w:lineRule="exact"/>
+            </w:pPr>
+            <w:r>
+              <w:rPr>
+                <w:rFonts w:ascii="Arial" w:hAnsi="Arial" w:eastAsia="Hiragino Sans GB"/>
+                <w:sz w:val="21"/>
+                <w:color w:val="000000"/>
+              </w:rPr>
+              <w:t>无原生BF16、无NVLink；旧卡及整机RAM需一起评估</w:t>
+            </w:r>
+          </w:p>
+        </w:tc>
+      </w:tr>
+    </w:tbl>
+    <w:p>
+      <w:pPr>
+        <w:snapToGrid w:val="0"/>
+      </w:pPr>
+      <w:r>
+        <w:t>H100 NVL 是每卡94GB，双卡合计188GB，不能写成一张188GB显卡；其显存带宽约3.9TB/s每卡。云产品的卡名还应与实际SKU、卡数、GPU互联、vCPU和系统内存对应。</w:t>
+      </w:r>
+    </w:p>
+    <w:p>
+      <w:pPr>
+        <w:pStyle w:val="Heading2"/>
+        <w:snapToGrid w:val="0"/>
+      </w:pPr>
+      <w:r>
+        <w:t>多卡与卸载的最后一轮检查</w:t>
+      </w:r>
+    </w:p>
+    <w:p>
+      <w:pPr>
+        <w:snapToGrid w:val="0"/>
+      </w:pPr>
+      <w:r>
+        <w:t>两张80GB显卡保留两个独立显存空间，程序必须显式分组件、切权重或切序列。TP/Ulysses等每层都有集合通信，优先查看同机NVLink/NVSwitch、P2P能力和PCIe拓扑；两台独立单卡主机不能直接当作一台双卡服务器。消费卡要核对实际PCIe通道、插槽和NUMA位置。</w:t>
+      </w:r>
+    </w:p>
+    <w:p>
+      <w:pPr>
+        <w:snapToGrid w:val="0"/>
+      </w:pPr>
+      <w:r>
+        <w:t>拿到主机后，用 nvidia-smi 查看型号、单卡显存与驱动，用 nvidia-smi topo -m 查看互联，再用 free -h 和 df -h 核对系统内存与持久盘。GPU执行采用对应上游SGLang或Diffusers后端；本项目交付的CPU runner与异步API则服务于最终选定的CPU路线。</w:t>
       </w:r>
     </w:p>
     <w:p>
@@ -13427,6 +15061,150 @@
       </w:pPr>
       <w:r>
         <w:t>标准显存配置为 16GB 或 8GB GDDR7；本文按自有显卡的 16GB 版评估。</w:t>
+      </w:r>
+    </w:p>
+    <w:p>
+      <w:pPr>
+        <w:pStyle w:val="Heading2"/>
+        <w:pageBreakBefore/>
+        <w:snapToGrid w:val="0"/>
+      </w:pPr>
+      <w:r>
+        <w:t>GPU 型号资料</w:t>
+      </w:r>
+    </w:p>
+    <w:p>
+      <w:pPr>
+        <w:pStyle w:val="Heading3"/>
+        <w:snapToGrid w:val="0"/>
+      </w:pPr>
+      <w:hyperlink r:id="rId34">
+        <w:r>
+          <w:t>14 NVIDIA 数据中心 GPU 规格</w:t>
+        </w:r>
+      </w:hyperlink>
+    </w:p>
+    <w:p>
+      <w:pPr>
+        <w:snapToGrid w:val="0"/>
+      </w:pPr>
+      <w:r>
+        <w:t>H200 的141GB与4.8TB/s规格，结合下列H100、A100和L40S官方资料比较。</w:t>
+      </w:r>
+    </w:p>
+    <w:p>
+      <w:pPr>
+        <w:pStyle w:val="Heading3"/>
+        <w:snapToGrid w:val="0"/>
+      </w:pPr>
+      <w:hyperlink r:id="rId35">
+        <w:r>
+          <w:t>H100 SXM 与 NVL</w:t>
+        </w:r>
+      </w:hyperlink>
+    </w:p>
+    <w:p>
+      <w:pPr>
+        <w:pStyle w:val="Heading3"/>
+        <w:snapToGrid w:val="0"/>
+      </w:pPr>
+      <w:hyperlink r:id="rId36">
+        <w:r>
+          <w:t>H100 PCIe 产品资料</w:t>
+        </w:r>
+      </w:hyperlink>
+    </w:p>
+    <w:p>
+      <w:pPr>
+        <w:pStyle w:val="Heading3"/>
+        <w:snapToGrid w:val="0"/>
+      </w:pPr>
+      <w:hyperlink r:id="rId37">
+        <w:r>
+          <w:t>A100 40GB 与 80GB</w:t>
+        </w:r>
+      </w:hyperlink>
+    </w:p>
+    <w:p>
+      <w:pPr>
+        <w:pStyle w:val="Heading3"/>
+        <w:snapToGrid w:val="0"/>
+      </w:pPr>
+      <w:hyperlink r:id="rId38">
+        <w:r>
+          <w:t>L40S 48GB</w:t>
+        </w:r>
+      </w:hyperlink>
+    </w:p>
+    <w:p>
+      <w:pPr>
+        <w:pStyle w:val="Heading3"/>
+        <w:snapToGrid w:val="0"/>
+      </w:pPr>
+      <w:hyperlink r:id="rId39">
+        <w:r>
+          <w:t>15 NVIDIA RTX Blackwell 架构白皮书</w:t>
+        </w:r>
+      </w:hyperlink>
+    </w:p>
+    <w:p>
+      <w:pPr>
+        <w:snapToGrid w:val="0"/>
+      </w:pPr>
+      <w:r>
+        <w:t>用于核对RTX5090的显存带宽与Blackwell原生精度；RTX5060Ti的448GB/s使用下列产品规格表，RTX4090使用Ada架构资料。</w:t>
+      </w:r>
+    </w:p>
+    <w:p>
+      <w:pPr>
+        <w:pStyle w:val="Heading3"/>
+        <w:snapToGrid w:val="0"/>
+      </w:pPr>
+      <w:hyperlink r:id="rId40">
+        <w:r>
+          <w:t>RTX 5060 Ti 显存与带宽规格</w:t>
+        </w:r>
+      </w:hyperlink>
+    </w:p>
+    <w:p>
+      <w:pPr>
+        <w:pStyle w:val="Heading3"/>
+        <w:snapToGrid w:val="0"/>
+      </w:pPr>
+      <w:hyperlink r:id="rId41">
+        <w:r>
+          <w:t>Ada GPU 架构白皮书</w:t>
+        </w:r>
+      </w:hyperlink>
+    </w:p>
+    <w:p>
+      <w:pPr>
+        <w:pStyle w:val="Heading3"/>
+        <w:snapToGrid w:val="0"/>
+      </w:pPr>
+      <w:hyperlink r:id="rId42">
+        <w:r>
+          <w:t>16 NVIDIA V100 资料</w:t>
+        </w:r>
+      </w:hyperlink>
+    </w:p>
+    <w:p>
+      <w:pPr>
+        <w:pStyle w:val="Heading3"/>
+        <w:snapToGrid w:val="0"/>
+      </w:pPr>
+      <w:hyperlink r:id="rId43">
+        <w:r>
+          <w:t>T4 Tensor Core GPU 资料</w:t>
+        </w:r>
+      </w:hyperlink>
+    </w:p>
+    <w:p>
+      <w:pPr>
+        <w:snapToGrid w:val="0"/>
+      </w:pPr>
+      <w:r>
+        <w:t>旧代GPU的显存、带宽、精度和封装互联需逐项对应；T4带宽按该产品资料约300GB/s记。</w:t>
       </w:r>
     </w:p>
     <w:tbl>

</xml_diff>

<commit_message>
docs: assess 5060 Ti desktop with 32GB system RAM
</commit_message>
<xml_diff>
--- a/docs/Minimax H3部署方案.docx
+++ b/docs/Minimax H3部署方案.docx
@@ -57,7 +57,7 @@
         <w:rPr>
           <w:lang w:val="en-US" w:eastAsia="zh-CN"/>
         </w:rPr>
-        <w:t xml:space="preserve">我的起点是把 H3 部署在自己的设备上。先查官方模型卡、框架配方和权重清单，再对照手头 RTX 5060 Ti 的 16GB 显存；完整权重路线的容量差距让我转向公司已有云账号。核对 GPU 的权限、库存与整机配置后，发现可以直接创建大核数、大内存 CPU ECS，才确定了后面的 CPU 部署路线。</w:t>
+        <w:t xml:space="preserve">我的起点是把 H3 部署在自己的设备上。先查官方模型卡、框架配方和权重清单，再对照手头 RTX 5060 Ti 的16GB显存与32GB系统内存：前者不足以完整常驻原精度大组件，后者也低于所查INT8卸载方案约75GB的主机权重需求。当前整机不满足这两条路线的条件，因此继续查公司已有云资源，最终选择能直接创建的大核数、大内存 CPU ECS。</w:t>
       </w:r>
     </w:p>
     <w:p>
@@ -99,13 +99,13 @@
           <w:lang w:val="en-US" w:eastAsia="zh-CN"/>
           <w:b/>
         </w:rPr>
-        <w:t xml:space="preserve">2 评估自己的 5060 Ti。</w:t>
+        <w:t xml:space="preserve">2 评估自己的整机。</w:t>
       </w:r>
       <w:r>
         <w:rPr>
           <w:lang w:val="en-US" w:eastAsia="zh-CN"/>
         </w:rPr>
-        <w:t xml:space="preserve">把 16GB 显存与完整 Transformer、文本编码器的容量对照，同时查看 INT8 与 CPU offload 配方的主机内存、画布和工作流条件。</w:t>
+        <w:t xml:space="preserve">把5060 Ti的16GB显存、32GB系统内存，分别与完整组件常驻和INT8＋CPU卸载的要求对照，再看画布、精度与主机配置。</w:t>
       </w:r>
     </w:p>
     <w:p>
@@ -214,7 +214,7 @@
         <w:rPr>
           <w:b w:val="0"/>
         </w:rPr>
-        <w:t>调研后的选择是：用公司已有云账号能开出的 160 vCPU、768GiB CPU ECS 承载 H3。自己的 RTX 5060 Ti 为 16GB 版，无法直接承载选定的完整权重常驻方式；大内存 CPU 则提供了模型加载空间。随后按完整单图 Ref2VA 推进，取得五秒和十五秒音视频，并封装成可调用的异步 API。</w:t>
+        <w:t>调研后的选择是：用公司已有云账号能开出的160 vCPU、768GiB CPU ECS承载H3。我的台式机是RTX5060 Ti 16GB显存＋32GB系统内存，既不满足完整权重常驻的显存要求，也不满足上述INT8卸载方案的主机内存条件。随后在云端按完整单图Ref2VA推进，取得五秒和十五秒音视频，并封装成可调用的异步API。</w:t>
       </w:r>
     </w:p>
     <w:tbl>
@@ -1033,7 +1033,7 @@
         <w:snapToGrid w:val="0"/>
       </w:pPr>
       <w:r>
-        <w:t>前期调研二 对照自己的 5060 Ti 16GB</w:t>
+        <w:t>前期调研二 对照 5060 Ti 整机配置</w:t>
       </w:r>
     </w:p>
     <w:p>
@@ -1041,7 +1041,7 @@
         <w:snapToGrid w:val="0"/>
       </w:pPr>
       <w:r>
-        <w:t>我的 RTX 5060 Ti 是 16GB 版，NVIDIA 官方规格也列有这一配置。[13] 对照上页可见，单个完整 Transformer 的文件体积就约 61.7GiB，文本编码器又是 62.1GiB 量级。因此，直接把所选完整权重以原始精度常驻到这张显卡的部署方式，在容量上不成立。这个判断来自组件与显存的对照。</w:t>
+        <w:t>我的台式机配置是RTX5060 Ti 16GB显存＋32GB系统内存，显卡规格对应NVIDIA的16GB版本。[13] 先看显存：单个完整Transformer文件约61.7GiB，文本编码器又是62.1GiB量级，16GB显存无法直接承载所选完整权重常驻方式。再看系统内存，它决定CPU卸载路线能暂存多少权重；两个容量需要分别判断。</w:t>
       </w:r>
     </w:p>
     <w:p>
@@ -1355,7 +1355,7 @@
         <w:snapToGrid w:val="0"/>
       </w:pPr>
       <w:r>
-        <w:t>进一步对照配方，可以看到低显存路线还要同时改变量化、主机内存安排、画布与组件调度。我的后续目标是 768P 单图 Ref2VA，并希望保留固定版本的完整权重，于是转向查找能容纳这套模型的现有云资源。</w:t>
+        <w:t>再核对主机RAM，我的机器只有32GB，低于上述INT8＋CPU卸载方案约75GB的主机权重需求，加载、激活和操作系统还需要余量。因此，当前整机不能直接采用该配方。这里的限制来自显存、RAM与运行方式的组合；16GB显卡本身仍有配合更大主机内存的低显存路线。</w:t>
       </w:r>
     </w:p>
     <w:p>
@@ -1380,7 +1380,7 @@
         <w:snapToGrid w:val="0"/>
       </w:pPr>
       <w:r>
-        <w:t>因此，我的决策链是：完整权重常驻方式超出 5060 Ti 16GB 的容量 → 查低显存配方的附加条件 → 结合 768P Ref2VA 目标与可用资源，转向云端大内存主机。</w:t>
+        <w:t>我的决策链是：16GB显存不足以完整常驻原精度组件 → 查看INT8＋CPU卸载配方 → 32GB系统内存低于该配方的主机权重需求 → 结合768P Ref2VA目标与可用资源，转向云端大内存主机。</w:t>
       </w:r>
     </w:p>
     <w:p>
@@ -2284,7 +2284,7 @@
         <w:snapToGrid w:val="0"/>
       </w:pPr>
       <w:r>
-        <w:t>对我的16GB 5060 Ti，完整精度大组件常驻路线在容量上不成立；低显存量化路线则需要改变精度、组件调度和画布。若希望升级消费卡，先比较24GB、32GB及48GB档位能采用的配方，再把主机内存、存储和总成本一起列入预算。</w:t>
+        <w:t>我的整机为5060 Ti 16GB显存＋32GB系统内存，不满足完整权重常驻或上述INT8＋CPU卸载方案的条件。表中的16GB低显存路线需要同时配足主机RAM；若保留显卡，可将128–256GB系统内存作为升级规划，256GB余量更宽裕，再与目标工作流、画布及加载方式匹配。本项目继续使用已选定的云CPU方案。</w:t>
       </w:r>
     </w:p>
     <w:p>
@@ -3037,7 +3037,7 @@
         <w:rPr>
           <w:b w:val="0"/>
         </w:rPr>
-        <w:t>本地显卡的直接部署方式被容量条件排除后，我继续看云 GPU。检查顺序是先对照 H3 配方中的显卡型号、单卡显存、卡数、互联与主机 RAM，再看公司已有云账号能否取得这类整机。低显存或卸载方案还涉及量化、精度和组件调度，不能只按“一张卡的租金”作决定。</w:t>
+        <w:t>对照16GB显存与32GB系统内存后，当前整机不符合完整权重常驻或上述INT8卸载方案的容量条件，我继续看云GPU。检查顺序是先对照H3配方中的显卡型号、单卡显存、卡数、互联与主机RAM，再看公司已有云账号能否取得这类整机。低显存或卸载方案还涉及量化、精度和组件调度，需要按完整配置作决定。</w:t>
       </w:r>
     </w:p>
     <w:p>
@@ -9522,7 +9522,7 @@
         <w:rPr>
           <w:b w:val="0"/>
         </w:rPr>
-        <w:t>完成模型要求与自有显卡评估后，我进一步确认了大内存 CPU 能否承载完整 H3 生成。在这台高内存 CPU 机器和固定软件版本上，完整单图 Ref2VA 能够生成音视频；模型容量与 CPU 执行路径都已落实，代价是长时间等待，以及仍然可观的云资源费用。</w:t>
+        <w:t>完成模型要求与本机显存、系统内存评估后，我进一步确认了大内存CPU能否承载完整H3生成。在这台高内存CPU机器和固定软件版本上，完整单图Ref2VA能够生成音视频；模型容量与CPU执行路径都已落实，代价是长时间等待，以及仍然可观的云资源费用。</w:t>
       </w:r>
     </w:p>
     <w:tbl>

</xml_diff>